<commit_message>
fix(chat): harden realtime messaging and eliminate client-side delays
</commit_message>
<xml_diff>
--- a/audit/Aura_Chat_Architecture_Report.docx
+++ b/audit/Aura_Chat_Architecture_Report.docx
@@ -11,9 +11,7 @@
           <w:b/>
           <w:sz w:val="48"/>
         </w:rPr>
-        <w:t>Aura Interiors</w:t>
-        <w:br/>
-        <w:t>Chat Architecture Report</w:t>
+        <w:t>Aura Interiors Chat Architecture Report</w:t>
       </w:r>
     </w:p>
     <w:p>
@@ -21,11 +19,20 @@
         <w:jc w:val="center"/>
       </w:pPr>
       <w:r>
+        <w:rPr>
+          <w:b/>
+        </w:rPr>
+        <w:t>Industry-grade chatbot pipeline audit and implementation status</w:t>
+        <w:br/>
+      </w:r>
+      <w:r>
         <w:t>Project: Aura Interiors</w:t>
         <w:br/>
         <w:t>Prepared by: Engineering Review</w:t>
         <w:br/>
-        <w:t>29 September 2026 | Version 1.0</w:t>
+        <w:t>Date: 29 September 2026</w:t>
+        <w:br/>
+        <w:t>Version: 1.0</w:t>
       </w:r>
     </w:p>
     <w:p>
@@ -43,7 +50,7 @@
     </w:p>
     <w:p>
       <w:r>
-        <w:t>Code-verified redesign of Aura Interiors' persistent chatbot toward a feature-flagged, queue-backed, tool-governed AI pipeline. The work adds deterministic routing, per-conversation serialization/cancellation, server-injected identity, a tool contract, provider/model circuit breaking, bounded tool execution, a system bot actor and narrow URL output guarding. Two consecutive executable local gates passed. Requested Jest/Supertest/in-memory Mongo, provider-key model listing, production-log inspection, real streaming, Redis adapter, 100-conversation eval, load/E2E tests and provider SLO measurements could not be completed because dependency installation timed out; these are marked BLOCKED or NEEDS VERIFICATION rather than inferred.</w:t>
+        <w:t>This report audits the Aura Interiors Express/Mongoose/Socket.IO chatbot against the requested production architecture. The supplied archive already contained a partial CHAT_PIPELINE=v2 implementation. Inspection confirmed that the legacy path retained deprecated-model risk, sequential provider behavior, admin-document bot identity, hot-path retrieval, broad intent matching and a broken escalation summarizer. The existing v2 addressed several concerns but remained incomplete: provider calls were non-streaming and the gate covered only five tests plus a router microbenchmark. This pass implemented provider SSE streaming with tool-call assembly, added security and stream-parser tests, and strengthened the gate to include all v2 syntax checks plus frontend lint and both frontend builds. Eight v2 tests pass. The strengthened full gate is BLOCKED because isolated npm installs did not complete within the execution window, leaving eslint/vite unavailable. Live provider model listing, production-log review, real-provider benchmarks, 100-conversation evals, load/E2E/failure-injection suites, Redis/BullMQ isolation and the Socket.IO Redis adapter remain NEEDS VERIFICATION or implementation. No production credentials were printed or intentionally used.</w:t>
       </w:r>
     </w:p>
     <w:p>
@@ -51,12 +58,30 @@
         <w:pStyle w:val="Title"/>
       </w:pPr>
       <w:r>
-        <w:t>1 Introduction and method</w:t>
+        <w:t>Contents</w:t>
       </w:r>
     </w:p>
     <w:p>
       <w:r>
-        <w:t>Authoritative source: aurainteriors(2).zip. Turfio was inspected only for lean design principles; its stateless architecture was not copied. Work was isolated on backend branch feat/chat-pipeline-v2. No real customer data or provider secrets were printed. Existing v1 remains the rollback path.</w:t>
+        <w:t>1 Introduction</w:t>
+        <w:br/>
+        <w:t>2 Background and standards</w:t>
+        <w:br/>
+        <w:t>3 Methodology</w:t>
+        <w:br/>
+        <w:t>4 Findings ledger</w:t>
+        <w:br/>
+        <w:t>5 Architecture</w:t>
+        <w:br/>
+        <w:t>6 Benchmark and SLO results</w:t>
+        <w:br/>
+        <w:t>7 Test and verification results</w:t>
+        <w:br/>
+        <w:t>8 Rollout and rollback</w:t>
+        <w:br/>
+        <w:t>9 Remaining risks and migration notes</w:t>
+        <w:br/>
+        <w:t>References</w:t>
       </w:r>
     </w:p>
     <w:p>
@@ -64,7 +89,51 @@
         <w:pStyle w:val="Title"/>
       </w:pPr>
       <w:r>
-        <w:t>2 Findings ledger</w:t>
+        <w:t>1 Introduction</w:t>
+      </w:r>
+    </w:p>
+    <w:p>
+      <w:r>
+        <w:t>Scope covers chat orchestration, v2 modules, persistence/realtime integration, tool identity, provider behavior, handoff, observability, tests, benchmark harness and frontend compatibility. Persistence, guest sessions, human handoff, admin chat console, attachments and notifications are preservation constraints.</w:t>
+      </w:r>
+    </w:p>
+    <w:p>
+      <w:r>
+        <w:t>Limitations: archived .env values were treated as compromised and were not used for live provider verification. Production logs were not supplied. The environment did not finish npm ci in the available execution window. External-provider behavior, real latency percentiles and production SLO compliance are therefore not claimed.</w:t>
+      </w:r>
+    </w:p>
+    <w:p>
+      <w:pPr>
+        <w:pStyle w:val="Title"/>
+      </w:pPr>
+      <w:r>
+        <w:t>2 Background and standards</w:t>
+      </w:r>
+    </w:p>
+    <w:p>
+      <w:r>
+        <w:t>The review uses OWASP application/API security principles, NIST digital identity guidance, CWE weakness taxonomy and RFC 8725 where applicable. Groq’s current deprecation history states that llama-3.3-70b-versatile was shut down for free/developer tiers on 16 August 2026 and recommends openai/gpt-oss-120b or successor Qwen models; Groq currently documents openai/gpt-oss-120b as served (Groq, 2026a; Groq, 2026b).</w:t>
+      </w:r>
+    </w:p>
+    <w:p>
+      <w:pPr>
+        <w:pStyle w:val="Title"/>
+      </w:pPr>
+      <w:r>
+        <w:t>3 Methodology</w:t>
+      </w:r>
+    </w:p>
+    <w:p>
+      <w:r>
+        <w:t>The archive was unpacked into an isolated working directory. SHA-256 baselines were recorded for non-example .env files and both .git directories before edits. Existing tests/gate were run before changes. Static inspection used symbols and behavior. Verification claims below are based only on executed checks; missing production evidence is labelled NEEDS VERIFICATION/BLOCKED.</w:t>
+      </w:r>
+    </w:p>
+    <w:p>
+      <w:pPr>
+        <w:pStyle w:val="Title"/>
+      </w:pPr>
+      <w:r>
+        <w:t>4 Findings ledger</w:t>
       </w:r>
     </w:p>
     <w:tbl>
@@ -74,24 +143,24 @@
         <w:tblLook w:firstColumn="1" w:firstRow="1" w:lastColumn="0" w:lastRow="0" w:noHBand="0" w:noVBand="1" w:val="04A0"/>
       </w:tblPr>
       <w:tblGrid>
-        <w:gridCol w:w="3312"/>
-        <w:gridCol w:w="3312"/>
-        <w:gridCol w:w="3312"/>
+        <w:gridCol w:w="2880"/>
+        <w:gridCol w:w="2880"/>
+        <w:gridCol w:w="2880"/>
       </w:tblGrid>
       <w:tr>
         <w:tc>
           <w:tcPr>
-            <w:tcW w:type="dxa" w:w="3312"/>
+            <w:tcW w:type="dxa" w:w="2880"/>
           </w:tcPr>
           <w:p>
             <w:r>
-              <w:t>ID</w:t>
+              <w:t>Finding</w:t>
             </w:r>
           </w:p>
         </w:tc>
         <w:tc>
           <w:tcPr>
-            <w:tcW w:type="dxa" w:w="3312"/>
+            <w:tcW w:type="dxa" w:w="2880"/>
           </w:tcPr>
           <w:p>
             <w:r>
@@ -101,11 +170,11 @@
         </w:tc>
         <w:tc>
           <w:tcPr>
-            <w:tcW w:type="dxa" w:w="3312"/>
+            <w:tcW w:type="dxa" w:w="2880"/>
           </w:tcPr>
           <w:p>
             <w:r>
-              <w:t>Evidence/action</w:t>
+              <w:t>Evidence / disposition</w:t>
             </w:r>
           </w:p>
         </w:tc>
@@ -113,7 +182,7 @@
       <w:tr>
         <w:tc>
           <w:tcPr>
-            <w:tcW w:type="dxa" w:w="3312"/>
+            <w:tcW w:type="dxa" w:w="2880"/>
           </w:tcPr>
           <w:p>
             <w:r>
@@ -123,21 +192,21 @@
         </w:tc>
         <w:tc>
           <w:tcPr>
-            <w:tcW w:type="dxa" w:w="3312"/>
+            <w:tcW w:type="dxa" w:w="2880"/>
           </w:tcPr>
           <w:p>
             <w:r>
-              <w:t>CONFIRMED / PARTIAL</w:t>
+              <w:t>CONFIRMED legacy / PARTIAL v2</w:t>
             </w:r>
           </w:p>
         </w:tc>
         <w:tc>
           <w:tcPr>
-            <w:tcW w:type="dxa" w:w="3312"/>
+            <w:tcW w:type="dxa" w:w="2880"/>
           </w:tcPr>
           <w:p>
             <w:r>
-              <w:t>Legacy default is llama-3.1-70b-versatile. Groq documents llama-3.3-70b-versatile shutdown on 16 Aug 2026 for free/developer tiers. v2 defaults Groq to openai/gpt-oss-120b. Configured-key model listing: NEEDS VERIFICATION.</w:t>
+              <w:t>Legacy defaults to llama-3.1-70b-versatile. v2 defaults Groq to openai/gpt-oss-120b and has model-list validation. Boot fail-fast/alert wiring and live-key/log confirmation remain NEEDS VERIFICATION.</w:t>
             </w:r>
           </w:p>
         </w:tc>
@@ -145,7 +214,7 @@
       <w:tr>
         <w:tc>
           <w:tcPr>
-            <w:tcW w:type="dxa" w:w="3312"/>
+            <w:tcW w:type="dxa" w:w="2880"/>
           </w:tcPr>
           <w:p>
             <w:r>
@@ -155,21 +224,21 @@
         </w:tc>
         <w:tc>
           <w:tcPr>
-            <w:tcW w:type="dxa" w:w="3312"/>
+            <w:tcW w:type="dxa" w:w="2880"/>
           </w:tcPr>
           <w:p>
             <w:r>
-              <w:t>CONFIRMED / PARTIAL</w:t>
+              <w:t>PARTIAL</w:t>
             </w:r>
           </w:p>
         </w:tc>
         <w:tc>
           <w:tcPr>
-            <w:tcW w:type="dxa" w:w="3312"/>
+            <w:tcW w:type="dxa" w:w="2880"/>
           </w:tcPr>
           <w:p>
             <w:r>
-              <w:t>v2 adds provider/model circuit breaker, retry-after handling, fatal-auth disable behavior, max_tokens, temperature and bounded total timeout. Hedging and true TTFT abort remain.</w:t>
+              <w:t>v2 has per-model breaker, total timeout, retry-after, max_tokens and temperature. Health ordering, effective TTFT cancellation, hedging and durable retries remain incomplete.</w:t>
             </w:r>
           </w:p>
         </w:tc>
@@ -177,7 +246,7 @@
       <w:tr>
         <w:tc>
           <w:tcPr>
-            <w:tcW w:type="dxa" w:w="3312"/>
+            <w:tcW w:type="dxa" w:w="2880"/>
           </w:tcPr>
           <w:p>
             <w:r>
@@ -187,21 +256,21 @@
         </w:tc>
         <w:tc>
           <w:tcPr>
-            <w:tcW w:type="dxa" w:w="3312"/>
+            <w:tcW w:type="dxa" w:w="2880"/>
           </w:tcPr>
           <w:p>
             <w:r>
-              <w:t>CONFIRMED / BLOCKED</w:t>
+              <w:t>FIXED v2</w:t>
             </w:r>
           </w:p>
         </w:tc>
         <w:tc>
           <w:tcPr>
-            <w:tcW w:type="dxa" w:w="3312"/>
+            <w:tcW w:type="dxa" w:w="2880"/>
           </w:tcPr>
           <w:p>
             <w:r>
-              <w:t>Legacy streaming is synthetic/non-used. True provider SSE and tool-call assembly remain BLOCKED.</w:t>
+              <w:t>Gateway now uses stream:true, assembles SSE content/tool calls and invokes onToken.</w:t>
             </w:r>
           </w:p>
         </w:tc>
@@ -209,7 +278,7 @@
       <w:tr>
         <w:tc>
           <w:tcPr>
-            <w:tcW w:type="dxa" w:w="3312"/>
+            <w:tcW w:type="dxa" w:w="2880"/>
           </w:tcPr>
           <w:p>
             <w:r>
@@ -219,21 +288,21 @@
         </w:tc>
         <w:tc>
           <w:tcPr>
-            <w:tcW w:type="dxa" w:w="3312"/>
+            <w:tcW w:type="dxa" w:w="2880"/>
           </w:tcPr>
           <w:p>
             <w:r>
-              <w:t>FIXED V2</w:t>
+              <w:t>FIXED v2</w:t>
             </w:r>
           </w:p>
         </w:tc>
         <w:tc>
           <w:tcPr>
-            <w:tcW w:type="dxa" w:w="3312"/>
+            <w:tcW w:type="dxa" w:w="2880"/>
           </w:tcPr>
           <w:p>
             <w:r>
-              <w:t>Every declared tool has a handler; executable contract test enforces parity.</w:t>
+              <w:t>All declared v2 tools have handlers; contract test passes.</w:t>
             </w:r>
           </w:p>
         </w:tc>
@@ -241,7 +310,7 @@
       <w:tr>
         <w:tc>
           <w:tcPr>
-            <w:tcW w:type="dxa" w:w="3312"/>
+            <w:tcW w:type="dxa" w:w="2880"/>
           </w:tcPr>
           <w:p>
             <w:r>
@@ -251,21 +320,21 @@
         </w:tc>
         <w:tc>
           <w:tcPr>
-            <w:tcW w:type="dxa" w:w="3312"/>
+            <w:tcW w:type="dxa" w:w="2880"/>
           </w:tcPr>
           <w:p>
             <w:r>
-              <w:t>FIXED V2 CORE</w:t>
+              <w:t>PARTIAL/FIXED core</w:t>
             </w:r>
           </w:p>
         </w:tc>
         <w:tc>
           <w:tcPr>
-            <w:tcW w:type="dxa" w:w="3312"/>
+            <w:tcW w:type="dxa" w:w="2880"/>
           </w:tcPr>
           <w:p>
             <w:r>
-              <w:t>userId is absent from model-visible schemas and stripped from arguments; verified server context supplies identity. Guest abuse limiter remains.</w:t>
+              <w:t>Model userId is stripped and account identity comes from server context. Guest lookup abuse-specific edge limiter remains unproven.</w:t>
             </w:r>
           </w:p>
         </w:tc>
@@ -273,7 +342,7 @@
       <w:tr>
         <w:tc>
           <w:tcPr>
-            <w:tcW w:type="dxa" w:w="3312"/>
+            <w:tcW w:type="dxa" w:w="2880"/>
           </w:tcPr>
           <w:p>
             <w:r>
@@ -283,7 +352,7 @@
         </w:tc>
         <w:tc>
           <w:tcPr>
-            <w:tcW w:type="dxa" w:w="3312"/>
+            <w:tcW w:type="dxa" w:w="2880"/>
           </w:tcPr>
           <w:p>
             <w:r>
@@ -293,11 +362,11 @@
         </w:tc>
         <w:tc>
           <w:tcPr>
-            <w:tcW w:type="dxa" w:w="3312"/>
+            <w:tcW w:type="dxa" w:w="2880"/>
           </w:tcPr>
           <w:p>
             <w:r>
-              <w:t>v2 removes recursive bot sendMessage and admin-user lookup. Exact DB-operation count requires integration instrumentation.</w:t>
+              <w:t>v2 avoids recursive sendMessage for final bot persistence; &lt;=3 pre-LLM DB operations is not instrumented end-to-end.</w:t>
             </w:r>
           </w:p>
         </w:tc>
@@ -305,7 +374,7 @@
       <w:tr>
         <w:tc>
           <w:tcPr>
-            <w:tcW w:type="dxa" w:w="3312"/>
+            <w:tcW w:type="dxa" w:w="2880"/>
           </w:tcPr>
           <w:p>
             <w:r>
@@ -315,21 +384,21 @@
         </w:tc>
         <w:tc>
           <w:tcPr>
-            <w:tcW w:type="dxa" w:w="3312"/>
+            <w:tcW w:type="dxa" w:w="2880"/>
           </w:tcPr>
           <w:p>
             <w:r>
-              <w:t>FIXED V2</w:t>
+              <w:t>PARTIAL</w:t>
             </w:r>
           </w:p>
         </w:tc>
         <w:tc>
           <w:tcPr>
-            <w:tcW w:type="dxa" w:w="3312"/>
+            <w:tcW w:type="dxa" w:w="2880"/>
           </w:tcPr>
           <w:p>
             <w:r>
-              <w:t>Bot/system messages can be senderless; no first-admin-as-bot lookup on v2.</w:t>
+              <w:t>v2 bot message can exist without a User sender, but legacy admin-backed paths remain and explicit system-actor migration is incomplete.</w:t>
             </w:r>
           </w:p>
         </w:tc>
@@ -337,7 +406,7 @@
       <w:tr>
         <w:tc>
           <w:tcPr>
-            <w:tcW w:type="dxa" w:w="3312"/>
+            <w:tcW w:type="dxa" w:w="2880"/>
           </w:tcPr>
           <w:p>
             <w:r>
@@ -347,7 +416,7 @@
         </w:tc>
         <w:tc>
           <w:tcPr>
-            <w:tcW w:type="dxa" w:w="3312"/>
+            <w:tcW w:type="dxa" w:w="2880"/>
           </w:tcPr>
           <w:p>
             <w:r>
@@ -357,11 +426,11 @@
         </w:tc>
         <w:tc>
           <w:tcPr>
-            <w:tcW w:type="dxa" w:w="3312"/>
+            <w:tcW w:type="dxa" w:w="2880"/>
           </w:tcPr>
           <w:p>
             <w:r>
-              <w:t>Retrieval is an explicit tool with a 900 ms caller budget. Embedding cache/static FAQ prefix remain.</w:t>
+              <w:t>retrieval is optional tool with integration timeout; embedding cache/static FAQ prefix remain open.</w:t>
             </w:r>
           </w:p>
         </w:tc>
@@ -369,7 +438,7 @@
       <w:tr>
         <w:tc>
           <w:tcPr>
-            <w:tcW w:type="dxa" w:w="3312"/>
+            <w:tcW w:type="dxa" w:w="2880"/>
           </w:tcPr>
           <w:p>
             <w:r>
@@ -379,21 +448,21 @@
         </w:tc>
         <w:tc>
           <w:tcPr>
-            <w:tcW w:type="dxa" w:w="3312"/>
+            <w:tcW w:type="dxa" w:w="2880"/>
           </w:tcPr>
           <w:p>
             <w:r>
-              <w:t>FIXED V2 CORE</w:t>
+              <w:t>FIXED v2</w:t>
             </w:r>
           </w:p>
         </w:tc>
         <w:tc>
           <w:tcPr>
-            <w:tcW w:type="dxa" w:w="3312"/>
+            <w:tcW w:type="dxa" w:w="2880"/>
           </w:tcPr>
           <w:p>
             <w:r>
-              <w:t>Anchored trivial router; handoff is an explicit tool with atomic ai_handling→escalated transition.</w:t>
+              <w:t>trivial router is anchored; explicit handoff tool exists. Legacy regex remains behind v1.</w:t>
             </w:r>
           </w:p>
         </w:tc>
@@ -401,7 +470,7 @@
       <w:tr>
         <w:tc>
           <w:tcPr>
-            <w:tcW w:type="dxa" w:w="3312"/>
+            <w:tcW w:type="dxa" w:w="2880"/>
           </w:tcPr>
           <w:p>
             <w:r>
@@ -411,7 +480,7 @@
         </w:tc>
         <w:tc>
           <w:tcPr>
-            <w:tcW w:type="dxa" w:w="3312"/>
+            <w:tcW w:type="dxa" w:w="2880"/>
           </w:tcPr>
           <w:p>
             <w:r>
@@ -421,11 +490,11 @@
         </w:tc>
         <w:tc>
           <w:tcPr>
-            <w:tcW w:type="dxa" w:w="3312"/>
+            <w:tcW w:type="dxa" w:w="2880"/>
           </w:tcPr>
           <w:p>
             <w:r>
-              <w:t>v2 uses a narrow function-tag/URL guard rather than sentence-deleting regexes; structured output remains provider-dependent.</w:t>
+              <w:t>v2 narrow output guard enforces Aura/tool URL allowlist. Structured-output strategy remains constrained by streaming/tool compatibility.</w:t>
             </w:r>
           </w:p>
         </w:tc>
@@ -433,7 +502,7 @@
       <w:tr>
         <w:tc>
           <w:tcPr>
-            <w:tcW w:type="dxa" w:w="3312"/>
+            <w:tcW w:type="dxa" w:w="2880"/>
           </w:tcPr>
           <w:p>
             <w:r>
@@ -443,21 +512,21 @@
         </w:tc>
         <w:tc>
           <w:tcPr>
-            <w:tcW w:type="dxa" w:w="3312"/>
+            <w:tcW w:type="dxa" w:w="2880"/>
           </w:tcPr>
           <w:p>
             <w:r>
-              <w:t>BYPASSED V2</w:t>
+              <w:t>OPEN legacy</w:t>
             </w:r>
           </w:p>
         </w:tc>
         <w:tc>
           <w:tcPr>
-            <w:tcW w:type="dxa" w:w="3312"/>
+            <w:tcW w:type="dxa" w:w="2880"/>
           </w:tcPr>
           <w:p>
             <w:r>
-              <w:t>Broken legacy escalation summarizer is not used; async handoff summary remains.</w:t>
+              <w:t>triggerEscalation still references undefined instance fields; v2 handoff bypasses it.</w:t>
             </w:r>
           </w:p>
         </w:tc>
@@ -465,7 +534,7 @@
       <w:tr>
         <w:tc>
           <w:tcPr>
-            <w:tcW w:type="dxa" w:w="3312"/>
+            <w:tcW w:type="dxa" w:w="2880"/>
           </w:tcPr>
           <w:p>
             <w:r>
@@ -475,21 +544,21 @@
         </w:tc>
         <w:tc>
           <w:tcPr>
-            <w:tcW w:type="dxa" w:w="3312"/>
+            <w:tcW w:type="dxa" w:w="2880"/>
           </w:tcPr>
           <w:p>
             <w:r>
-              <w:t>FIXED LOCALLY</w:t>
+              <w:t>PARTIAL</w:t>
             </w:r>
           </w:p>
         </w:tc>
         <w:tc>
           <w:tcPr>
-            <w:tcW w:type="dxa" w:w="3312"/>
+            <w:tcW w:type="dxa" w:w="2880"/>
           </w:tcPr>
           <w:p>
             <w:r>
-              <w:t>Keyed per-chat queue serializes turns and supports cancellation; worker isolation/BullMQ remains.</w:t>
+              <w:t>keyed in-process queue serializes/cancels; worker isolation/BullMQ not implemented.</w:t>
             </w:r>
           </w:p>
         </w:tc>
@@ -497,7 +566,7 @@
       <w:tr>
         <w:tc>
           <w:tcPr>
-            <w:tcW w:type="dxa" w:w="3312"/>
+            <w:tcW w:type="dxa" w:w="2880"/>
           </w:tcPr>
           <w:p>
             <w:r>
@@ -507,21 +576,21 @@
         </w:tc>
         <w:tc>
           <w:tcPr>
-            <w:tcW w:type="dxa" w:w="3312"/>
+            <w:tcW w:type="dxa" w:w="2880"/>
           </w:tcPr>
           <w:p>
             <w:r>
-              <w:t>BLOCKED</w:t>
+              <w:t>OPEN</w:t>
             </w:r>
           </w:p>
         </w:tc>
         <w:tc>
           <w:tcPr>
-            <w:tcW w:type="dxa" w:w="3312"/>
+            <w:tcW w:type="dxa" w:w="2880"/>
           </w:tcPr>
           <w:p>
             <w:r>
-              <w:t>Socket.IO Redis adapter remains required for multi-node production.</w:t>
+              <w:t>Socket.IO Redis adapter not implemented.</w:t>
             </w:r>
           </w:p>
         </w:tc>
@@ -529,7 +598,7 @@
       <w:tr>
         <w:tc>
           <w:tcPr>
-            <w:tcW w:type="dxa" w:w="3312"/>
+            <w:tcW w:type="dxa" w:w="2880"/>
           </w:tcPr>
           <w:p>
             <w:r>
@@ -539,7 +608,7 @@
         </w:tc>
         <w:tc>
           <w:tcPr>
-            <w:tcW w:type="dxa" w:w="3312"/>
+            <w:tcW w:type="dxa" w:w="2880"/>
           </w:tcPr>
           <w:p>
             <w:r>
@@ -549,11 +618,11 @@
         </w:tc>
         <w:tc>
           <w:tcPr>
-            <w:tcW w:type="dxa" w:w="3312"/>
+            <w:tcW w:type="dxa" w:w="2880"/>
           </w:tcPr>
           <w:p>
             <w:r>
-              <w:t>Constant instructions precede conversation data; history window expanded. Rolling summary persistence remains.</w:t>
+              <w:t>v2 uses 12-message history plus summary field and labels data untrusted; rolling summary persistence not implemented.</w:t>
             </w:r>
           </w:p>
         </w:tc>
@@ -561,7 +630,7 @@
       <w:tr>
         <w:tc>
           <w:tcPr>
-            <w:tcW w:type="dxa" w:w="3312"/>
+            <w:tcW w:type="dxa" w:w="2880"/>
           </w:tcPr>
           <w:p>
             <w:r>
@@ -571,7 +640,7 @@
         </w:tc>
         <w:tc>
           <w:tcPr>
-            <w:tcW w:type="dxa" w:w="3312"/>
+            <w:tcW w:type="dxa" w:w="2880"/>
           </w:tcPr>
           <w:p>
             <w:r>
@@ -581,11 +650,11 @@
         </w:tc>
         <w:tc>
           <w:tcPr>
-            <w:tcW w:type="dxa" w:w="3312"/>
+            <w:tcW w:type="dxa" w:w="2880"/>
           </w:tcPr>
           <w:p>
             <w:r>
-              <w:t>Contract tests, two-pass gate and benchmark added; full Jest/Supertest/Mongo-memory/eval/load/E2E stack blocked by dependency install.</w:t>
+              <w:t>trace scaffold/tests exist; comprehensive metrics/evals/structured production logging remain incomplete.</w:t>
             </w:r>
           </w:p>
         </w:tc>
@@ -596,12 +665,51 @@
         <w:pStyle w:val="Title"/>
       </w:pPr>
       <w:r>
-        <w:t>3 Target architecture implemented behind CHAT_PIPELINE=v2</w:t>
+        <w:t>5 Architecture</w:t>
+      </w:r>
+    </w:p>
+    <w:p>
+      <w:pPr>
+        <w:jc w:val="center"/>
+      </w:pPr>
+      <w:r>
+        <w:drawing>
+          <wp:inline xmlns:a="http://schemas.openxmlformats.org/drawingml/2006/main" xmlns:pic="http://schemas.openxmlformats.org/drawingml/2006/picture">
+            <wp:extent cx="6035040" cy="3701210"/>
+            <wp:docPr id="1" name="Picture 1"/>
+            <wp:cNvGraphicFramePr>
+              <a:graphicFrameLocks noChangeAspect="1"/>
+            </wp:cNvGraphicFramePr>
+            <a:graphic>
+              <a:graphicData uri="http://schemas.openxmlformats.org/drawingml/2006/picture">
+                <pic:pic>
+                  <pic:nvPicPr>
+                    <pic:cNvPr id="0" name="chat_v2_architecture.png"/>
+                    <pic:cNvPicPr/>
+                  </pic:nvPicPr>
+                  <pic:blipFill>
+                    <a:blip r:embed="rId9"/>
+                    <a:stretch>
+                      <a:fillRect/>
+                    </a:stretch>
+                  </pic:blipFill>
+                  <pic:spPr>
+                    <a:xfrm>
+                      <a:off x="0" y="0"/>
+                      <a:ext cx="6035040" cy="3701210"/>
+                    </a:xfrm>
+                    <a:prstGeom prst="rect"/>
+                  </pic:spPr>
+                </pic:pic>
+              </a:graphicData>
+            </a:graphic>
+          </wp:inline>
+        </w:drawing>
       </w:r>
     </w:p>
     <w:p>
       <w:r>
-        <w:t>Edge → persist once → HTTP 202 → keyed per-chat queue → stateless pipeline → anchored router → context builder → LLM gateway → parallel tool executor → output guard → persist one bot message → Socket.IO. The AI core imports neither Express nor Socket.IO; realtime is an adapter concern in ChatService.</w:t>
+        <w:t>Figure 1. v2 module boundary. A Mermaid renderer was unavailable in the execution environment; this equivalent rendered diagram is included. Mermaid-rendered output is NEEDS VERIFICATION.</w:t>
       </w:r>
     </w:p>
     <w:p>
@@ -609,37 +717,25 @@
         <w:pStyle w:val="Heading1"/>
       </w:pPr>
       <w:r>
-        <w:t>Figure 1. Architecture (Mermaid source and rendered interpretation)</w:t>
+        <w:t>5.1 Implemented interfaces</w:t>
       </w:r>
     </w:p>
     <w:p>
       <w:r>
-        <w:t>flowchart LR</w:t>
-        <w:br/>
-        <w:t>A[HTTP Edge] --&gt; B[Persist once / 202]</w:t>
-        <w:br/>
-        <w:t>B --&gt; C[Per-chat Turn Queue]</w:t>
-        <w:br/>
-        <w:t>C --&gt; D[Router]</w:t>
-        <w:br/>
-        <w:t>D --&gt; E[Context Builder]</w:t>
-        <w:br/>
-        <w:t>E --&gt; F[LLM Gateway]</w:t>
-        <w:br/>
-        <w:t>F --&gt; G[Tool Registry]</w:t>
-        <w:br/>
-        <w:t>G --&gt; H[(Mongo / Retrieval)]</w:t>
-        <w:br/>
-        <w:t>F --&gt; I[Output Guard]</w:t>
-        <w:br/>
-        <w:t>I --&gt; J[Persist bot once]</w:t>
-        <w:br/>
-        <w:t>J --&gt; K[Socket.IO]</w:t>
+        <w:t>The archive contains config, router, context builder, output guard, pipeline, circuit breaker, LLM gateway, keyed turn queue, tool registry and turn-trace modules. Integration emits ai:token/ai:complete, persists the final v2 bot message once, and attempts the ai_handling → escalated transition atomically.</w:t>
+      </w:r>
+    </w:p>
+    <w:p>
+      <w:pPr>
+        <w:pStyle w:val="Heading1"/>
+      </w:pPr>
+      <w:r>
+        <w:t>5.2 Required increments</w:t>
       </w:r>
     </w:p>
     <w:p>
       <w:r>
-        <w:t>Rendered interpretation: queueing is the concurrency boundary; identity enters from verified server context; model-visible tools cannot choose a userId; the bot is a system actor rather than an administrator document.</w:t>
+        <w:t>Add 202 edge acceptance with idempotency persistence; durable BullMQ/Redis workers; Redis Socket.IO adapter; explicit system actor; rolling summary storage; retrieval cache; typed event contracts; provider health ordering/hedging; production metrics and alerting.</w:t>
       </w:r>
     </w:p>
     <w:p>
@@ -647,25 +743,7 @@
         <w:pStyle w:val="Title"/>
       </w:pPr>
       <w:r>
-        <w:t>4 Security and correctness</w:t>
-      </w:r>
-    </w:p>
-    <w:p>
-      <w:r>
-        <w:t>Account tools require server identity. The executor removes model-supplied userId. Customer/retrieved text is labelled untrusted data. Arbitrary external URLs are removed unless they use an Aura origin or were returned by a tool. Remaining work includes guest order abuse limits, PII-safe structured logs, injection evals and attachment/socket authorization regression tests.</w:t>
-      </w:r>
-    </w:p>
-    <w:p>
-      <w:pPr>
-        <w:pStyle w:val="Title"/>
-      </w:pPr>
-      <w:r>
-        <w:t>5 Executed verification</w:t>
-      </w:r>
-    </w:p>
-    <w:p>
-      <w:r>
-        <w:t>Two consecutive local gates passed. Each ran five Node contract/unit tests, syntax checks and a deterministic routing benchmark. The measured local 41-prompt router run reported mean 0.007 ms and max 0.151 ms. This measures only deterministic routing, not provider or database latency.</w:t>
+        <w:t>6 Benchmark and SLO results</w:t>
       </w:r>
     </w:p>
     <w:tbl>
@@ -675,45 +753,45 @@
         <w:tblLook w:firstColumn="1" w:firstRow="1" w:lastColumn="0" w:lastRow="0" w:noHBand="0" w:noVBand="1" w:val="04A0"/>
       </w:tblPr>
       <w:tblGrid>
-        <w:gridCol w:w="2484"/>
-        <w:gridCol w:w="2484"/>
-        <w:gridCol w:w="2484"/>
-        <w:gridCol w:w="2484"/>
+        <w:gridCol w:w="2160"/>
+        <w:gridCol w:w="2160"/>
+        <w:gridCol w:w="2160"/>
+        <w:gridCol w:w="2160"/>
       </w:tblGrid>
       <w:tr>
         <w:tc>
           <w:tcPr>
-            <w:tcW w:type="dxa" w:w="2484"/>
+            <w:tcW w:type="dxa" w:w="2160"/>
           </w:tcPr>
           <w:p>
             <w:r>
-              <w:t>SLO</w:t>
+              <w:t>Measure</w:t>
             </w:r>
           </w:p>
         </w:tc>
         <w:tc>
           <w:tcPr>
-            <w:tcW w:type="dxa" w:w="2484"/>
+            <w:tcW w:type="dxa" w:w="2160"/>
           </w:tcPr>
           <w:p>
             <w:r>
-              <w:t>Baseline</w:t>
+              <w:t>Executed result</w:t>
             </w:r>
           </w:p>
         </w:tc>
         <w:tc>
           <w:tcPr>
-            <w:tcW w:type="dxa" w:w="2484"/>
+            <w:tcW w:type="dxa" w:w="2160"/>
           </w:tcPr>
           <w:p>
             <w:r>
-              <w:t>After</w:t>
+              <w:t>Target</w:t>
             </w:r>
           </w:p>
         </w:tc>
         <w:tc>
           <w:tcPr>
-            <w:tcW w:type="dxa" w:w="2484"/>
+            <w:tcW w:type="dxa" w:w="2160"/>
           </w:tcPr>
           <w:p>
             <w:r>
@@ -725,41 +803,41 @@
       <w:tr>
         <w:tc>
           <w:tcPr>
-            <w:tcW w:type="dxa" w:w="2484"/>
+            <w:tcW w:type="dxa" w:w="2160"/>
           </w:tcPr>
           <w:p>
             <w:r>
-              <w:t>Trivial intent &lt;50 ms</w:t>
+              <w:t>Deterministic router</w:t>
             </w:r>
           </w:p>
         </w:tc>
         <w:tc>
           <w:tcPr>
-            <w:tcW w:type="dxa" w:w="2484"/>
+            <w:tcW w:type="dxa" w:w="2160"/>
           </w:tcPr>
           <w:p>
             <w:r>
-              <w:t>Not isolated</w:t>
+              <w:t>41 prompts; mean ~0.006 ms; max ~0.118 ms</w:t>
             </w:r>
           </w:p>
         </w:tc>
         <w:tc>
           <w:tcPr>
-            <w:tcW w:type="dxa" w:w="2484"/>
+            <w:tcW w:type="dxa" w:w="2160"/>
           </w:tcPr>
           <w:p>
             <w:r>
-              <w:t>0.007 ms mean; 0.151 ms max</w:t>
+              <w:t>&lt;50 ms</w:t>
             </w:r>
           </w:p>
         </w:tc>
         <w:tc>
           <w:tcPr>
-            <w:tcW w:type="dxa" w:w="2484"/>
+            <w:tcW w:type="dxa" w:w="2160"/>
           </w:tcPr>
           <w:p>
             <w:r>
-              <w:t>MEASURED PASS</w:t>
+              <w:t>PASS, local router only</w:t>
             </w:r>
           </w:p>
         </w:tc>
@@ -767,17 +845,17 @@
       <w:tr>
         <w:tc>
           <w:tcPr>
-            <w:tcW w:type="dxa" w:w="2484"/>
+            <w:tcW w:type="dxa" w:w="2160"/>
           </w:tcPr>
           <w:p>
             <w:r>
-              <w:t>No-tool TTFT p50&lt;1.2s/p95&lt;2.5s</w:t>
+              <w:t>No-tool TTFT</w:t>
             </w:r>
           </w:p>
         </w:tc>
         <w:tc>
           <w:tcPr>
-            <w:tcW w:type="dxa" w:w="2484"/>
+            <w:tcW w:type="dxa" w:w="2160"/>
           </w:tcPr>
           <w:p>
             <w:r>
@@ -787,17 +865,17 @@
         </w:tc>
         <w:tc>
           <w:tcPr>
-            <w:tcW w:type="dxa" w:w="2484"/>
+            <w:tcW w:type="dxa" w:w="2160"/>
           </w:tcPr>
           <w:p>
             <w:r>
-              <w:t>Not measured</w:t>
+              <w:t>p50 &lt;1.2 s; p95 &lt;2.5 s</w:t>
             </w:r>
           </w:p>
         </w:tc>
         <w:tc>
           <w:tcPr>
-            <w:tcW w:type="dxa" w:w="2484"/>
+            <w:tcW w:type="dxa" w:w="2160"/>
           </w:tcPr>
           <w:p>
             <w:r>
@@ -809,17 +887,17 @@
       <w:tr>
         <w:tc>
           <w:tcPr>
-            <w:tcW w:type="dxa" w:w="2484"/>
+            <w:tcW w:type="dxa" w:w="2160"/>
           </w:tcPr>
           <w:p>
             <w:r>
-              <w:t>Tool total p50&lt;3s/p95&lt;6s</w:t>
+              <w:t>Tool total</w:t>
             </w:r>
           </w:p>
         </w:tc>
         <w:tc>
           <w:tcPr>
-            <w:tcW w:type="dxa" w:w="2484"/>
+            <w:tcW w:type="dxa" w:w="2160"/>
           </w:tcPr>
           <w:p>
             <w:r>
@@ -829,17 +907,17 @@
         </w:tc>
         <w:tc>
           <w:tcPr>
-            <w:tcW w:type="dxa" w:w="2484"/>
+            <w:tcW w:type="dxa" w:w="2160"/>
           </w:tcPr>
           <w:p>
             <w:r>
-              <w:t>Not measured</w:t>
+              <w:t>p50 &lt;3 s; p95 &lt;6 s</w:t>
             </w:r>
           </w:p>
         </w:tc>
         <w:tc>
           <w:tcPr>
-            <w:tcW w:type="dxa" w:w="2484"/>
+            <w:tcW w:type="dxa" w:w="2160"/>
           </w:tcPr>
           <w:p>
             <w:r>
@@ -851,17 +929,17 @@
       <w:tr>
         <w:tc>
           <w:tcPr>
-            <w:tcW w:type="dxa" w:w="2484"/>
+            <w:tcW w:type="dxa" w:w="2160"/>
           </w:tcPr>
           <w:p>
             <w:r>
-              <w:t>Outage degraded &lt;6s</w:t>
+              <w:t>Provider outage</w:t>
             </w:r>
           </w:p>
         </w:tc>
         <w:tc>
           <w:tcPr>
-            <w:tcW w:type="dxa" w:w="2484"/>
+            <w:tcW w:type="dxa" w:w="2160"/>
           </w:tcPr>
           <w:p>
             <w:r>
@@ -871,17 +949,17 @@
         </w:tc>
         <w:tc>
           <w:tcPr>
-            <w:tcW w:type="dxa" w:w="2484"/>
+            <w:tcW w:type="dxa" w:w="2160"/>
           </w:tcPr>
           <w:p>
             <w:r>
-              <w:t>Fallback implemented</w:t>
+              <w:t>&lt;6 s degraded</w:t>
             </w:r>
           </w:p>
         </w:tc>
         <w:tc>
           <w:tcPr>
-            <w:tcW w:type="dxa" w:w="2484"/>
+            <w:tcW w:type="dxa" w:w="2160"/>
           </w:tcPr>
           <w:p>
             <w:r>
@@ -893,37 +971,37 @@
       <w:tr>
         <w:tc>
           <w:tcPr>
-            <w:tcW w:type="dxa" w:w="2484"/>
+            <w:tcW w:type="dxa" w:w="2160"/>
           </w:tcPr>
           <w:p>
             <w:r>
-              <w:t>Hot-path DB ops &lt;=3</w:t>
+              <w:t>Pre-LLM DB ops</w:t>
             </w:r>
           </w:p>
         </w:tc>
         <w:tc>
           <w:tcPr>
-            <w:tcW w:type="dxa" w:w="2484"/>
+            <w:tcW w:type="dxa" w:w="2160"/>
           </w:tcPr>
           <w:p>
             <w:r>
-              <w:t>~dozen+ by inspection</w:t>
+              <w:t>Not instrumented</w:t>
             </w:r>
           </w:p>
         </w:tc>
         <w:tc>
           <w:tcPr>
-            <w:tcW w:type="dxa" w:w="2484"/>
+            <w:tcW w:type="dxa" w:w="2160"/>
           </w:tcPr>
           <w:p>
             <w:r>
-              <w:t>Structurally reduced</w:t>
+              <w:t>&lt;=3</w:t>
             </w:r>
           </w:p>
         </w:tc>
         <w:tc>
           <w:tcPr>
-            <w:tcW w:type="dxa" w:w="2484"/>
+            <w:tcW w:type="dxa" w:w="2160"/>
           </w:tcPr>
           <w:p>
             <w:r>
@@ -932,102 +1010,10 @@
           </w:p>
         </w:tc>
       </w:tr>
-      <w:tr>
-        <w:tc>
-          <w:tcPr>
-            <w:tcW w:type="dxa" w:w="2484"/>
-          </w:tcPr>
-          <w:p>
-            <w:r>
-              <w:t>100 golden conversations</w:t>
-            </w:r>
-          </w:p>
-        </w:tc>
-        <w:tc>
-          <w:tcPr>
-            <w:tcW w:type="dxa" w:w="2484"/>
-          </w:tcPr>
-          <w:p>
-            <w:r>
-              <w:t>Absent</w:t>
-            </w:r>
-          </w:p>
-        </w:tc>
-        <w:tc>
-          <w:tcPr>
-            <w:tcW w:type="dxa" w:w="2484"/>
-          </w:tcPr>
-          <w:p>
-            <w:r>
-              <w:t>Not executed</w:t>
-            </w:r>
-          </w:p>
-        </w:tc>
-        <w:tc>
-          <w:tcPr>
-            <w:tcW w:type="dxa" w:w="2484"/>
-          </w:tcPr>
-          <w:p>
-            <w:r>
-              <w:t>BLOCKED</w:t>
-            </w:r>
-          </w:p>
-        </w:tc>
-      </w:tr>
-      <w:tr>
-        <w:tc>
-          <w:tcPr>
-            <w:tcW w:type="dxa" w:w="2484"/>
-          </w:tcPr>
-          <w:p>
-            <w:r>
-              <w:t>Load/E2E/failure injection</w:t>
-            </w:r>
-          </w:p>
-        </w:tc>
-        <w:tc>
-          <w:tcPr>
-            <w:tcW w:type="dxa" w:w="2484"/>
-          </w:tcPr>
-          <w:p>
-            <w:r>
-              <w:t>Absent</w:t>
-            </w:r>
-          </w:p>
-        </w:tc>
-        <w:tc>
-          <w:tcPr>
-            <w:tcW w:type="dxa" w:w="2484"/>
-          </w:tcPr>
-          <w:p>
-            <w:r>
-              <w:t>Not executed</w:t>
-            </w:r>
-          </w:p>
-        </w:tc>
-        <w:tc>
-          <w:tcPr>
-            <w:tcW w:type="dxa" w:w="2484"/>
-          </w:tcPr>
-          <w:p>
-            <w:r>
-              <w:t>BLOCKED</w:t>
-            </w:r>
-          </w:p>
-        </w:tc>
-      </w:tr>
     </w:tbl>
     <w:p>
-      <w:pPr>
-        <w:pStyle w:val="Title"/>
-      </w:pPr>
       <w:r>
-        <w:t>6 Preflight blockers</w:t>
-      </w:r>
-    </w:p>
-    <w:p>
-      <w:r>
-        <w:t>Installation of zod, pino, @socket.io/redis-adapter, redis, Jest, Supertest and mongodb-memory-server was attempted but timed out and the packages were not available afterward. Therefore the requested full preflight and integration gates cannot truthfully be marked complete. Frontend build/E2E and configured-key model listing were not verified. No secrets were printed or copied into the report.</w:t>
+        <w:t>The requested baseline-vs-Turfio 40-prompt benchmark is not implemented by the existing harness; it currently exercises the deterministic router only. No untested latency, failure or fallback numbers are reported.</w:t>
       </w:r>
     </w:p>
     <w:p>
@@ -1035,12 +1021,22 @@
         <w:pStyle w:val="Title"/>
       </w:pPr>
       <w:r>
-        <w:t>7 Rollout and rollback</w:t>
+        <w:t>7 Test and verification results</w:t>
       </w:r>
     </w:p>
     <w:p>
       <w:r>
-        <w:t>Keep CHAT_PIPELINE=v1 initially. Complete blocked dependencies and integration tests, then shadow v2 without customer-visible output, compare tool choice/grounding/latency, canary a small percentage, and expand only with healthy dashboards. Kill switch: CHAT_PIPELINE=v1 plus worker restart. No data migration is required by this patch.</w:t>
+        <w:t>Executed v2 Node suite: 8/8 passed: declared-tool/handler parity, server-controlled identity, anchored routing, URL guard, queue serialization, SSE parsing and guest/account security checks.</w:t>
+      </w:r>
+    </w:p>
+    <w:p>
+      <w:r>
+        <w:t>Strengthened full gate: BLOCKED. Backend v2 tests, syntax checks and router benchmark passed. Frontend lint/customer build/admin build could not execute because eslint/vite were unavailable while npm ci remained incomplete. Two consecutive clean full passes were not achieved.</w:t>
+      </w:r>
+    </w:p>
+    <w:p>
+      <w:r>
+        <w:t>Integrity: non-example .env SHA-256 set unchanged and frontend/backend .git SHA-256 set unchanged. No clean commits were created because the standing preservation constraint forbids modifying .git. The supplied backend was already on feat/chat-pipeline-v2; this deliverable conflict was not silently bypassed.</w:t>
       </w:r>
     </w:p>
     <w:p>
@@ -1048,12 +1044,12 @@
         <w:pStyle w:val="Title"/>
       </w:pPr>
       <w:r>
-        <w:t>8 Migration notes</w:t>
+        <w:t>8 Rollout and rollback</w:t>
       </w:r>
     </w:p>
     <w:p>
       <w:r>
-        <w:t>New modules: backend/services/chatV2. Gate: backend/scripts/run-chat-gate.sh. Benchmark: backend/scripts/chat-benchmark.js. Safe placeholders were added to .env.example only; real .env files were not edited. v2 returns HTTP 202 after persistence and processes the AI turn asynchronously. Branch: feat/chat-pipeline-v2. Commit: cfd1c35.</w:t>
+        <w:t>Complete parity/evals with v1 intact; shadow v2 with responses suppressed; canary by stable conversation hash; increase only under agreed error/fallback/handoff/latency thresholds; kill switch back to v1; preserve backward-compatible persistence fields through the rollback window. Do not canary until durable queue/realtime multi-node behavior and guest abuse limits are verified.</w:t>
       </w:r>
     </w:p>
     <w:p>
@@ -1061,12 +1057,12 @@
         <w:pStyle w:val="Title"/>
       </w:pPr>
       <w:r>
-        <w:t>9 Remaining risks</w:t>
+        <w:t>9 Remaining risks and migration notes</w:t>
       </w:r>
     </w:p>
     <w:p>
       <w:r>
-        <w:t>Do not claim production SLO completion yet. Required gates: real provider model validation at boot, true streaming/tool assembly, Redis/BullMQ worker isolation and Socket.IO adapter, rolling summaries, retrieval/catalog caches, guest abuse limiter, structured metrics/logging, 100+ golden evals, concurrent load/failure injection, and browser E2E of guest/admin/handoff/attachments.</w:t>
+        <w:t>Highest risks: durability/horizontal scaling, incomplete edge idempotency/rate limiting, missing rolling summaries/retrieval cache, incomplete system-actor migration, lack of 100+ golden evals/load/E2E/failure-injection suites, and unverified live provider/model health. Production enablement remains blocked until closed or explicitly accepted.</w:t>
       </w:r>
     </w:p>
     <w:p>
@@ -1079,32 +1075,47 @@
     </w:p>
     <w:p>
       <w:r>
-        <w:t>Groq (2026) ‘Model Deprecation’. GroqDocs. Available at: https://console.groq.com/docs/deprecations (Accessed: 29 September 2026).</w:t>
+        <w:t>Groq (2026a) ‘Model Deprecation’. GroqDocs. Available at: https://console.groq.com/docs/deprecations (Accessed: 29 September 2026).</w:t>
       </w:r>
     </w:p>
     <w:p>
       <w:r>
-        <w:t>Groq (2026) ‘Supported Models’. GroqDocs. Available at: https://console.groq.com/docs/models (Accessed: 29 September 2026).</w:t>
+        <w:t>Groq (2026b) ‘OpenAI GPT-OSS 120B’. GroqDocs. Available at: https://console.groq.com/docs/model/openai/gpt-oss-120b (Accessed: 29 September 2026).</w:t>
       </w:r>
     </w:p>
     <w:p>
       <w:r>
-        <w:t>Groq (2026) ‘Rate Limits’. GroqDocs. Available at: https://console.groq.com/docs/rate-limits (Accessed: 29 September 2026).</w:t>
+        <w:t>Groq (2026c) ‘Rate Limits’. GroqDocs. Available at: https://console.groq.com/docs/rate-limits (Accessed: 29 September 2026).</w:t>
       </w:r>
     </w:p>
     <w:p>
       <w:r>
-        <w:t>OWASP Foundation (2023) ‘OWASP Top 10 for Large Language Model Applications’. OWASP.</w:t>
+        <w:t>OWASP Foundation (2023) OWASP API Security Top 10. OWASP.</w:t>
       </w:r>
     </w:p>
     <w:p>
       <w:r>
-        <w:t>OWASP Foundation (2023) ‘OWASP API Security Top 10’. OWASP.</w:t>
+        <w:t>OWASP Foundation (2021) OWASP Top 10. OWASP.</w:t>
+      </w:r>
+    </w:p>
+    <w:p>
+      <w:r>
+        <w:t>NIST (2020) Digital Identity Guidelines: Authentication and Lifecycle Management, SP 800-63B.</w:t>
+      </w:r>
+    </w:p>
+    <w:p>
+      <w:r>
+        <w:t>IETF (2020) JSON Web Token Best Current Practices, RFC 8725.</w:t>
+      </w:r>
+    </w:p>
+    <w:p>
+      <w:r>
+        <w:t>MITRE (2026) Common Weakness Enumeration (CWE).</w:t>
       </w:r>
     </w:p>
     <w:sectPr>
       <w:pgSz w:w="12240" w:h="15840"/>
-      <w:pgMar w:top="1008" w:right="1152" w:bottom="1008" w:left="1152" w:header="720" w:footer="720" w:gutter="0"/>
+      <w:pgMar w:top="1440" w:right="1800" w:bottom="1440" w:left="1800" w:header="720" w:footer="720" w:gutter="0"/>
       <w:cols w:space="720"/>
       <w:docGrid w:linePitch="360"/>
     </w:sectPr>
@@ -1494,6 +1505,9 @@
       </w:tabs>
       <w:spacing w:after="0" w:line="240" w:lineRule="auto"/>
     </w:pPr>
+    <w:rPr>
+      <w:rFonts w:ascii="Arial" w:hAnsi="Arial"/>
+    </w:rPr>
   </w:style>
   <w:style w:type="character" w:customStyle="1" w:styleId="HeaderChar">
     <w:name w:val="Header Char"/>
@@ -1501,6 +1515,9 @@
     <w:link w:val="Header"/>
     <w:uiPriority w:val="99"/>
     <w:rsid w:val="00E618BF"/>
+    <w:rPr>
+      <w:rFonts w:ascii="Arial" w:hAnsi="Arial"/>
+    </w:rPr>
   </w:style>
   <w:style w:type="paragraph" w:styleId="Footer">
     <w:name w:val="footer"/>
@@ -1516,6 +1533,9 @@
       </w:tabs>
       <w:spacing w:after="0" w:line="240" w:lineRule="auto"/>
     </w:pPr>
+    <w:rPr>
+      <w:rFonts w:ascii="Arial" w:hAnsi="Arial"/>
+    </w:rPr>
   </w:style>
   <w:style w:type="character" w:customStyle="1" w:styleId="FooterChar">
     <w:name w:val="Footer Char"/>
@@ -1523,6 +1543,9 @@
     <w:link w:val="Footer"/>
     <w:uiPriority w:val="99"/>
     <w:rsid w:val="00E618BF"/>
+    <w:rPr>
+      <w:rFonts w:ascii="Arial" w:hAnsi="Arial"/>
+    </w:rPr>
   </w:style>
   <w:style w:type="paragraph" w:styleId="Heading1">
     <w:name w:val="heading 1"/>
@@ -1539,7 +1562,7 @@
       <w:outlineLvl w:val="0"/>
     </w:pPr>
     <w:rPr>
-      <w:rFonts w:asciiTheme="majorHAnsi" w:eastAsiaTheme="majorEastAsia" w:hAnsiTheme="majorHAnsi" w:cstheme="majorBidi"/>
+      <w:rFonts w:asciiTheme="majorHAnsi" w:eastAsiaTheme="majorEastAsia" w:hAnsiTheme="majorHAnsi" w:cstheme="majorBidi" w:ascii="Arial" w:hAnsi="Arial"/>
       <w:b/>
       <w:bCs/>
       <w:color w:val="365F91" w:themeColor="accent1" w:themeShade="BF"/>
@@ -1563,7 +1586,7 @@
       <w:outlineLvl w:val="1"/>
     </w:pPr>
     <w:rPr>
-      <w:rFonts w:asciiTheme="majorHAnsi" w:eastAsiaTheme="majorEastAsia" w:hAnsiTheme="majorHAnsi" w:cstheme="majorBidi"/>
+      <w:rFonts w:asciiTheme="majorHAnsi" w:eastAsiaTheme="majorEastAsia" w:hAnsiTheme="majorHAnsi" w:cstheme="majorBidi" w:ascii="Arial" w:hAnsi="Arial"/>
       <w:b/>
       <w:bCs/>
       <w:color w:val="4F81BD" w:themeColor="accent1"/>
@@ -1587,7 +1610,7 @@
       <w:outlineLvl w:val="2"/>
     </w:pPr>
     <w:rPr>
-      <w:rFonts w:asciiTheme="majorHAnsi" w:eastAsiaTheme="majorEastAsia" w:hAnsiTheme="majorHAnsi" w:cstheme="majorBidi"/>
+      <w:rFonts w:asciiTheme="majorHAnsi" w:eastAsiaTheme="majorEastAsia" w:hAnsiTheme="majorHAnsi" w:cstheme="majorBidi" w:ascii="Arial" w:hAnsi="Arial"/>
       <w:b/>
       <w:bCs/>
       <w:color w:val="4F81BD" w:themeColor="accent1"/>
@@ -1610,7 +1633,7 @@
       <w:outlineLvl w:val="3"/>
     </w:pPr>
     <w:rPr>
-      <w:rFonts w:asciiTheme="majorHAnsi" w:eastAsiaTheme="majorEastAsia" w:hAnsiTheme="majorHAnsi" w:cstheme="majorBidi"/>
+      <w:rFonts w:asciiTheme="majorHAnsi" w:eastAsiaTheme="majorEastAsia" w:hAnsiTheme="majorHAnsi" w:cstheme="majorBidi" w:ascii="Arial" w:hAnsi="Arial"/>
       <w:b/>
       <w:bCs/>
       <w:i/>
@@ -1635,7 +1658,7 @@
       <w:outlineLvl w:val="4"/>
     </w:pPr>
     <w:rPr>
-      <w:rFonts w:asciiTheme="majorHAnsi" w:eastAsiaTheme="majorEastAsia" w:hAnsiTheme="majorHAnsi" w:cstheme="majorBidi"/>
+      <w:rFonts w:asciiTheme="majorHAnsi" w:eastAsiaTheme="majorEastAsia" w:hAnsiTheme="majorHAnsi" w:cstheme="majorBidi" w:ascii="Arial" w:hAnsi="Arial"/>
       <w:color w:val="243F60" w:themeColor="accent1" w:themeShade="7F"/>
     </w:rPr>
   </w:style>
@@ -1656,7 +1679,7 @@
       <w:outlineLvl w:val="5"/>
     </w:pPr>
     <w:rPr>
-      <w:rFonts w:asciiTheme="majorHAnsi" w:eastAsiaTheme="majorEastAsia" w:hAnsiTheme="majorHAnsi" w:cstheme="majorBidi"/>
+      <w:rFonts w:asciiTheme="majorHAnsi" w:eastAsiaTheme="majorEastAsia" w:hAnsiTheme="majorHAnsi" w:cstheme="majorBidi" w:ascii="Arial" w:hAnsi="Arial"/>
       <w:i/>
       <w:iCs/>
       <w:color w:val="243F60" w:themeColor="accent1" w:themeShade="7F"/>
@@ -1679,7 +1702,7 @@
       <w:outlineLvl w:val="6"/>
     </w:pPr>
     <w:rPr>
-      <w:rFonts w:asciiTheme="majorHAnsi" w:eastAsiaTheme="majorEastAsia" w:hAnsiTheme="majorHAnsi" w:cstheme="majorBidi"/>
+      <w:rFonts w:asciiTheme="majorHAnsi" w:eastAsiaTheme="majorEastAsia" w:hAnsiTheme="majorHAnsi" w:cstheme="majorBidi" w:ascii="Arial" w:hAnsi="Arial"/>
       <w:i/>
       <w:iCs/>
       <w:color w:val="404040" w:themeColor="text1" w:themeTint="BF"/>
@@ -1702,7 +1725,7 @@
       <w:outlineLvl w:val="7"/>
     </w:pPr>
     <w:rPr>
-      <w:rFonts w:asciiTheme="majorHAnsi" w:eastAsiaTheme="majorEastAsia" w:hAnsiTheme="majorHAnsi" w:cstheme="majorBidi"/>
+      <w:rFonts w:asciiTheme="majorHAnsi" w:eastAsiaTheme="majorEastAsia" w:hAnsiTheme="majorHAnsi" w:cstheme="majorBidi" w:ascii="Arial" w:hAnsi="Arial"/>
       <w:color w:val="4F81BD" w:themeColor="accent1"/>
       <w:sz w:val="20"/>
       <w:szCs w:val="20"/>
@@ -1725,7 +1748,7 @@
       <w:outlineLvl w:val="8"/>
     </w:pPr>
     <w:rPr>
-      <w:rFonts w:asciiTheme="majorHAnsi" w:eastAsiaTheme="majorEastAsia" w:hAnsiTheme="majorHAnsi" w:cstheme="majorBidi"/>
+      <w:rFonts w:asciiTheme="majorHAnsi" w:eastAsiaTheme="majorEastAsia" w:hAnsiTheme="majorHAnsi" w:cstheme="majorBidi" w:ascii="Arial" w:hAnsi="Arial"/>
       <w:i/>
       <w:iCs/>
       <w:color w:val="404040" w:themeColor="text1" w:themeTint="BF"/>
@@ -1738,12 +1761,18 @@
     <w:uiPriority w:val="1"/>
     <w:semiHidden/>
     <w:unhideWhenUsed/>
+    <w:rPr>
+      <w:rFonts w:ascii="Arial" w:hAnsi="Arial"/>
+    </w:rPr>
   </w:style>
   <w:style w:type="table" w:default="1" w:styleId="TableNormal">
     <w:name w:val="Normal Table"/>
     <w:uiPriority w:val="99"/>
     <w:semiHidden/>
     <w:unhideWhenUsed/>
+    <w:rPr>
+      <w:rFonts w:ascii="Arial" w:hAnsi="Arial"/>
+    </w:rPr>
     <w:tblPr>
       <w:tblInd w:w="0" w:type="dxa"/>
       <w:tblCellMar>
@@ -1768,6 +1797,9 @@
     <w:pPr>
       <w:spacing w:after="0" w:line="240" w:lineRule="auto"/>
     </w:pPr>
+    <w:rPr>
+      <w:rFonts w:ascii="Arial" w:hAnsi="Arial"/>
+    </w:rPr>
   </w:style>
   <w:style w:type="character" w:customStyle="1" w:styleId="Heading1Char">
     <w:name w:val="Heading 1 Char"/>
@@ -1776,7 +1808,7 @@
     <w:uiPriority w:val="9"/>
     <w:rsid w:val="00FC693F"/>
     <w:rPr>
-      <w:rFonts w:asciiTheme="majorHAnsi" w:eastAsiaTheme="majorEastAsia" w:hAnsiTheme="majorHAnsi" w:cstheme="majorBidi"/>
+      <w:rFonts w:asciiTheme="majorHAnsi" w:eastAsiaTheme="majorEastAsia" w:hAnsiTheme="majorHAnsi" w:cstheme="majorBidi" w:ascii="Arial" w:hAnsi="Arial"/>
       <w:b/>
       <w:bCs/>
       <w:color w:val="365F91" w:themeColor="accent1" w:themeShade="BF"/>
@@ -1791,7 +1823,7 @@
     <w:uiPriority w:val="9"/>
     <w:rsid w:val="00FC693F"/>
     <w:rPr>
-      <w:rFonts w:asciiTheme="majorHAnsi" w:eastAsiaTheme="majorEastAsia" w:hAnsiTheme="majorHAnsi" w:cstheme="majorBidi"/>
+      <w:rFonts w:asciiTheme="majorHAnsi" w:eastAsiaTheme="majorEastAsia" w:hAnsiTheme="majorHAnsi" w:cstheme="majorBidi" w:ascii="Arial" w:hAnsi="Arial"/>
       <w:b/>
       <w:bCs/>
       <w:color w:val="4F81BD" w:themeColor="accent1"/>
@@ -1806,7 +1838,7 @@
     <w:uiPriority w:val="9"/>
     <w:rsid w:val="00FC693F"/>
     <w:rPr>
-      <w:rFonts w:asciiTheme="majorHAnsi" w:eastAsiaTheme="majorEastAsia" w:hAnsiTheme="majorHAnsi" w:cstheme="majorBidi"/>
+      <w:rFonts w:asciiTheme="majorHAnsi" w:eastAsiaTheme="majorEastAsia" w:hAnsiTheme="majorHAnsi" w:cstheme="majorBidi" w:ascii="Arial" w:hAnsi="Arial"/>
       <w:b/>
       <w:bCs/>
       <w:color w:val="4F81BD" w:themeColor="accent1"/>
@@ -1828,7 +1860,7 @@
       <w:contextualSpacing/>
     </w:pPr>
     <w:rPr>
-      <w:rFonts w:asciiTheme="majorHAnsi" w:eastAsiaTheme="majorEastAsia" w:hAnsiTheme="majorHAnsi" w:cstheme="majorBidi"/>
+      <w:rFonts w:asciiTheme="majorHAnsi" w:eastAsiaTheme="majorEastAsia" w:hAnsiTheme="majorHAnsi" w:cstheme="majorBidi" w:ascii="Arial" w:hAnsi="Arial"/>
       <w:color w:val="17365D" w:themeColor="text2" w:themeShade="BF"/>
       <w:spacing w:val="5"/>
       <w:kern w:val="28"/>
@@ -1843,7 +1875,7 @@
     <w:uiPriority w:val="10"/>
     <w:rsid w:val="00FC693F"/>
     <w:rPr>
-      <w:rFonts w:asciiTheme="majorHAnsi" w:eastAsiaTheme="majorEastAsia" w:hAnsiTheme="majorHAnsi" w:cstheme="majorBidi"/>
+      <w:rFonts w:asciiTheme="majorHAnsi" w:eastAsiaTheme="majorEastAsia" w:hAnsiTheme="majorHAnsi" w:cstheme="majorBidi" w:ascii="Arial" w:hAnsi="Arial"/>
       <w:color w:val="17365D" w:themeColor="text2" w:themeShade="BF"/>
       <w:spacing w:val="5"/>
       <w:kern w:val="28"/>
@@ -1865,7 +1897,7 @@
       </w:numPr>
     </w:pPr>
     <w:rPr>
-      <w:rFonts w:asciiTheme="majorHAnsi" w:eastAsiaTheme="majorEastAsia" w:hAnsiTheme="majorHAnsi" w:cstheme="majorBidi"/>
+      <w:rFonts w:asciiTheme="majorHAnsi" w:eastAsiaTheme="majorEastAsia" w:hAnsiTheme="majorHAnsi" w:cstheme="majorBidi" w:ascii="Arial" w:hAnsi="Arial"/>
       <w:i/>
       <w:iCs/>
       <w:color w:val="4F81BD" w:themeColor="accent1"/>
@@ -1881,7 +1913,7 @@
     <w:uiPriority w:val="11"/>
     <w:rsid w:val="00FC693F"/>
     <w:rPr>
-      <w:rFonts w:asciiTheme="majorHAnsi" w:eastAsiaTheme="majorEastAsia" w:hAnsiTheme="majorHAnsi" w:cstheme="majorBidi"/>
+      <w:rFonts w:asciiTheme="majorHAnsi" w:eastAsiaTheme="majorEastAsia" w:hAnsiTheme="majorHAnsi" w:cstheme="majorBidi" w:ascii="Arial" w:hAnsi="Arial"/>
       <w:i/>
       <w:iCs/>
       <w:color w:val="4F81BD" w:themeColor="accent1"/>
@@ -1900,6 +1932,9 @@
       <w:ind w:left="720"/>
       <w:contextualSpacing/>
     </w:pPr>
+    <w:rPr>
+      <w:rFonts w:ascii="Arial" w:hAnsi="Arial"/>
+    </w:rPr>
   </w:style>
   <w:style w:type="paragraph" w:styleId="BodyText">
     <w:name w:val="Body Text"/>
@@ -1911,6 +1946,9 @@
     <w:pPr>
       <w:spacing w:after="120"/>
     </w:pPr>
+    <w:rPr>
+      <w:rFonts w:ascii="Arial" w:hAnsi="Arial"/>
+    </w:rPr>
   </w:style>
   <w:style w:type="character" w:customStyle="1" w:styleId="BodyTextChar">
     <w:name w:val="Body Text Char"/>
@@ -1918,6 +1956,9 @@
     <w:link w:val="BodyText"/>
     <w:uiPriority w:val="99"/>
     <w:rsid w:val="00AA1D8D"/>
+    <w:rPr>
+      <w:rFonts w:ascii="Arial" w:hAnsi="Arial"/>
+    </w:rPr>
   </w:style>
   <w:style w:type="paragraph" w:styleId="BodyText2">
     <w:name w:val="Body Text 2"/>
@@ -1929,6 +1970,9 @@
     <w:pPr>
       <w:spacing w:after="120" w:line="480" w:lineRule="auto"/>
     </w:pPr>
+    <w:rPr>
+      <w:rFonts w:ascii="Arial" w:hAnsi="Arial"/>
+    </w:rPr>
   </w:style>
   <w:style w:type="character" w:customStyle="1" w:styleId="BodyText2Char">
     <w:name w:val="Body Text 2 Char"/>
@@ -1936,6 +1980,9 @@
     <w:link w:val="BodyText2"/>
     <w:uiPriority w:val="99"/>
     <w:rsid w:val="00AA1D8D"/>
+    <w:rPr>
+      <w:rFonts w:ascii="Arial" w:hAnsi="Arial"/>
+    </w:rPr>
   </w:style>
   <w:style w:type="paragraph" w:styleId="BodyText3">
     <w:name w:val="Body Text 3"/>
@@ -1948,6 +1995,7 @@
       <w:spacing w:after="120"/>
     </w:pPr>
     <w:rPr>
+      <w:rFonts w:ascii="Arial" w:hAnsi="Arial"/>
       <w:sz w:val="16"/>
       <w:szCs w:val="16"/>
     </w:rPr>
@@ -1959,6 +2007,7 @@
     <w:uiPriority w:val="99"/>
     <w:rsid w:val="00AA1D8D"/>
     <w:rPr>
+      <w:rFonts w:ascii="Arial" w:hAnsi="Arial"/>
       <w:sz w:val="16"/>
       <w:szCs w:val="16"/>
     </w:rPr>
@@ -1973,6 +2022,9 @@
       <w:ind w:left="360" w:hanging="360"/>
       <w:contextualSpacing/>
     </w:pPr>
+    <w:rPr>
+      <w:rFonts w:ascii="Arial" w:hAnsi="Arial"/>
+    </w:rPr>
   </w:style>
   <w:style w:type="paragraph" w:styleId="List2">
     <w:name w:val="List 2"/>
@@ -1984,6 +2036,9 @@
       <w:ind w:left="720" w:hanging="360"/>
       <w:contextualSpacing/>
     </w:pPr>
+    <w:rPr>
+      <w:rFonts w:ascii="Arial" w:hAnsi="Arial"/>
+    </w:rPr>
   </w:style>
   <w:style w:type="paragraph" w:styleId="List3">
     <w:name w:val="List 3"/>
@@ -1995,6 +2050,9 @@
       <w:ind w:left="1080" w:hanging="360"/>
       <w:contextualSpacing/>
     </w:pPr>
+    <w:rPr>
+      <w:rFonts w:ascii="Arial" w:hAnsi="Arial"/>
+    </w:rPr>
   </w:style>
   <w:style w:type="paragraph" w:styleId="ListBullet">
     <w:name w:val="List Bullet"/>
@@ -2008,6 +2066,9 @@
       </w:numPr>
       <w:contextualSpacing/>
     </w:pPr>
+    <w:rPr>
+      <w:rFonts w:ascii="Arial" w:hAnsi="Arial"/>
+    </w:rPr>
   </w:style>
   <w:style w:type="paragraph" w:styleId="ListBullet2">
     <w:name w:val="List Bullet 2"/>
@@ -2021,6 +2082,9 @@
       </w:numPr>
       <w:contextualSpacing/>
     </w:pPr>
+    <w:rPr>
+      <w:rFonts w:ascii="Arial" w:hAnsi="Arial"/>
+    </w:rPr>
   </w:style>
   <w:style w:type="paragraph" w:styleId="ListBullet3">
     <w:name w:val="List Bullet 3"/>
@@ -2034,6 +2098,9 @@
       </w:numPr>
       <w:contextualSpacing/>
     </w:pPr>
+    <w:rPr>
+      <w:rFonts w:ascii="Arial" w:hAnsi="Arial"/>
+    </w:rPr>
   </w:style>
   <w:style w:type="paragraph" w:styleId="ListNumber">
     <w:name w:val="List Number"/>
@@ -2047,6 +2114,9 @@
       </w:numPr>
       <w:contextualSpacing/>
     </w:pPr>
+    <w:rPr>
+      <w:rFonts w:ascii="Arial" w:hAnsi="Arial"/>
+    </w:rPr>
   </w:style>
   <w:style w:type="paragraph" w:styleId="ListNumber2">
     <w:name w:val="List Number 2"/>
@@ -2060,6 +2130,9 @@
       </w:numPr>
       <w:contextualSpacing/>
     </w:pPr>
+    <w:rPr>
+      <w:rFonts w:ascii="Arial" w:hAnsi="Arial"/>
+    </w:rPr>
   </w:style>
   <w:style w:type="paragraph" w:styleId="ListNumber3">
     <w:name w:val="List Number 3"/>
@@ -2073,6 +2146,9 @@
       </w:numPr>
       <w:contextualSpacing/>
     </w:pPr>
+    <w:rPr>
+      <w:rFonts w:ascii="Arial" w:hAnsi="Arial"/>
+    </w:rPr>
   </w:style>
   <w:style w:type="paragraph" w:styleId="ListContinue">
     <w:name w:val="List Continue"/>
@@ -2085,6 +2161,9 @@
       <w:ind w:left="360"/>
       <w:contextualSpacing/>
     </w:pPr>
+    <w:rPr>
+      <w:rFonts w:ascii="Arial" w:hAnsi="Arial"/>
+    </w:rPr>
   </w:style>
   <w:style w:type="paragraph" w:styleId="ListContinue2">
     <w:name w:val="List Continue 2"/>
@@ -2097,6 +2176,9 @@
       <w:ind w:left="720"/>
       <w:contextualSpacing/>
     </w:pPr>
+    <w:rPr>
+      <w:rFonts w:ascii="Arial" w:hAnsi="Arial"/>
+    </w:rPr>
   </w:style>
   <w:style w:type="paragraph" w:styleId="ListContinue3">
     <w:name w:val="List Continue 3"/>
@@ -2109,6 +2191,9 @@
       <w:ind w:left="1080"/>
       <w:contextualSpacing/>
     </w:pPr>
+    <w:rPr>
+      <w:rFonts w:ascii="Arial" w:hAnsi="Arial"/>
+    </w:rPr>
   </w:style>
   <w:style w:type="paragraph" w:styleId="MacroText">
     <w:name w:val="macro"/>
@@ -2128,7 +2213,7 @@
       </w:tabs>
     </w:pPr>
     <w:rPr>
-      <w:rFonts w:ascii="Courier" w:hAnsi="Courier"/>
+      <w:rFonts w:ascii="Arial" w:hAnsi="Arial"/>
       <w:sz w:val="20"/>
       <w:szCs w:val="20"/>
     </w:rPr>
@@ -2140,7 +2225,7 @@
     <w:uiPriority w:val="99"/>
     <w:rsid w:val="0029639D"/>
     <w:rPr>
-      <w:rFonts w:ascii="Courier" w:hAnsi="Courier"/>
+      <w:rFonts w:ascii="Arial" w:hAnsi="Arial"/>
       <w:sz w:val="20"/>
       <w:szCs w:val="20"/>
     </w:rPr>
@@ -2154,6 +2239,7 @@
     <w:qFormat/>
     <w:rsid w:val="00FC693F"/>
     <w:rPr>
+      <w:rFonts w:ascii="Arial" w:hAnsi="Arial"/>
       <w:i/>
       <w:iCs/>
       <w:color w:val="000000" w:themeColor="text1"/>
@@ -2166,6 +2252,7 @@
     <w:uiPriority w:val="29"/>
     <w:rsid w:val="00FC693F"/>
     <w:rPr>
+      <w:rFonts w:ascii="Arial" w:hAnsi="Arial"/>
       <w:i/>
       <w:iCs/>
       <w:color w:val="000000" w:themeColor="text1"/>
@@ -2179,7 +2266,7 @@
     <w:semiHidden/>
     <w:rsid w:val="00FC693F"/>
     <w:rPr>
-      <w:rFonts w:asciiTheme="majorHAnsi" w:eastAsiaTheme="majorEastAsia" w:hAnsiTheme="majorHAnsi" w:cstheme="majorBidi"/>
+      <w:rFonts w:asciiTheme="majorHAnsi" w:eastAsiaTheme="majorEastAsia" w:hAnsiTheme="majorHAnsi" w:cstheme="majorBidi" w:ascii="Arial" w:hAnsi="Arial"/>
       <w:b/>
       <w:bCs/>
       <w:i/>
@@ -2195,7 +2282,7 @@
     <w:semiHidden/>
     <w:rsid w:val="00FC693F"/>
     <w:rPr>
-      <w:rFonts w:asciiTheme="majorHAnsi" w:eastAsiaTheme="majorEastAsia" w:hAnsiTheme="majorHAnsi" w:cstheme="majorBidi"/>
+      <w:rFonts w:asciiTheme="majorHAnsi" w:eastAsiaTheme="majorEastAsia" w:hAnsiTheme="majorHAnsi" w:cstheme="majorBidi" w:ascii="Arial" w:hAnsi="Arial"/>
       <w:color w:val="243F60" w:themeColor="accent1" w:themeShade="7F"/>
     </w:rPr>
   </w:style>
@@ -2207,7 +2294,7 @@
     <w:semiHidden/>
     <w:rsid w:val="00FC693F"/>
     <w:rPr>
-      <w:rFonts w:asciiTheme="majorHAnsi" w:eastAsiaTheme="majorEastAsia" w:hAnsiTheme="majorHAnsi" w:cstheme="majorBidi"/>
+      <w:rFonts w:asciiTheme="majorHAnsi" w:eastAsiaTheme="majorEastAsia" w:hAnsiTheme="majorHAnsi" w:cstheme="majorBidi" w:ascii="Arial" w:hAnsi="Arial"/>
       <w:i/>
       <w:iCs/>
       <w:color w:val="243F60" w:themeColor="accent1" w:themeShade="7F"/>
@@ -2221,7 +2308,7 @@
     <w:semiHidden/>
     <w:rsid w:val="00FC693F"/>
     <w:rPr>
-      <w:rFonts w:asciiTheme="majorHAnsi" w:eastAsiaTheme="majorEastAsia" w:hAnsiTheme="majorHAnsi" w:cstheme="majorBidi"/>
+      <w:rFonts w:asciiTheme="majorHAnsi" w:eastAsiaTheme="majorEastAsia" w:hAnsiTheme="majorHAnsi" w:cstheme="majorBidi" w:ascii="Arial" w:hAnsi="Arial"/>
       <w:i/>
       <w:iCs/>
       <w:color w:val="404040" w:themeColor="text1" w:themeTint="BF"/>
@@ -2235,7 +2322,7 @@
     <w:semiHidden/>
     <w:rsid w:val="00FC693F"/>
     <w:rPr>
-      <w:rFonts w:asciiTheme="majorHAnsi" w:eastAsiaTheme="majorEastAsia" w:hAnsiTheme="majorHAnsi" w:cstheme="majorBidi"/>
+      <w:rFonts w:asciiTheme="majorHAnsi" w:eastAsiaTheme="majorEastAsia" w:hAnsiTheme="majorHAnsi" w:cstheme="majorBidi" w:ascii="Arial" w:hAnsi="Arial"/>
       <w:color w:val="4F81BD" w:themeColor="accent1"/>
       <w:sz w:val="20"/>
       <w:szCs w:val="20"/>
@@ -2249,7 +2336,7 @@
     <w:semiHidden/>
     <w:rsid w:val="00FC693F"/>
     <w:rPr>
-      <w:rFonts w:asciiTheme="majorHAnsi" w:eastAsiaTheme="majorEastAsia" w:hAnsiTheme="majorHAnsi" w:cstheme="majorBidi"/>
+      <w:rFonts w:asciiTheme="majorHAnsi" w:eastAsiaTheme="majorEastAsia" w:hAnsiTheme="majorHAnsi" w:cstheme="majorBidi" w:ascii="Arial" w:hAnsi="Arial"/>
       <w:i/>
       <w:iCs/>
       <w:color w:val="404040" w:themeColor="text1" w:themeTint="BF"/>
@@ -2270,6 +2357,7 @@
       <w:spacing w:line="240" w:lineRule="auto"/>
     </w:pPr>
     <w:rPr>
+      <w:rFonts w:ascii="Arial" w:hAnsi="Arial"/>
       <w:b/>
       <w:bCs/>
       <w:color w:val="4F81BD" w:themeColor="accent1"/>
@@ -2284,6 +2372,7 @@
     <w:qFormat/>
     <w:rsid w:val="00FC693F"/>
     <w:rPr>
+      <w:rFonts w:ascii="Arial" w:hAnsi="Arial"/>
       <w:b/>
       <w:bCs/>
     </w:rPr>
@@ -2295,6 +2384,7 @@
     <w:qFormat/>
     <w:rsid w:val="00FC693F"/>
     <w:rPr>
+      <w:rFonts w:ascii="Arial" w:hAnsi="Arial"/>
       <w:i/>
       <w:iCs/>
     </w:rPr>
@@ -2315,6 +2405,7 @@
       <w:ind w:left="936" w:right="936"/>
     </w:pPr>
     <w:rPr>
+      <w:rFonts w:ascii="Arial" w:hAnsi="Arial"/>
       <w:b/>
       <w:bCs/>
       <w:i/>
@@ -2329,6 +2420,7 @@
     <w:uiPriority w:val="30"/>
     <w:rsid w:val="00FC693F"/>
     <w:rPr>
+      <w:rFonts w:ascii="Arial" w:hAnsi="Arial"/>
       <w:b/>
       <w:bCs/>
       <w:i/>
@@ -2343,6 +2435,7 @@
     <w:qFormat/>
     <w:rsid w:val="00FC693F"/>
     <w:rPr>
+      <w:rFonts w:ascii="Arial" w:hAnsi="Arial"/>
       <w:i/>
       <w:iCs/>
       <w:color w:val="808080" w:themeColor="text1" w:themeTint="7F"/>
@@ -2355,6 +2448,7 @@
     <w:qFormat/>
     <w:rsid w:val="00FC693F"/>
     <w:rPr>
+      <w:rFonts w:ascii="Arial" w:hAnsi="Arial"/>
       <w:b/>
       <w:bCs/>
       <w:i/>
@@ -2369,6 +2463,7 @@
     <w:qFormat/>
     <w:rsid w:val="00FC693F"/>
     <w:rPr>
+      <w:rFonts w:ascii="Arial" w:hAnsi="Arial"/>
       <w:smallCaps/>
       <w:color w:val="C0504D" w:themeColor="accent2"/>
       <w:u w:val="single"/>
@@ -2381,6 +2476,7 @@
     <w:qFormat/>
     <w:rsid w:val="00FC693F"/>
     <w:rPr>
+      <w:rFonts w:ascii="Arial" w:hAnsi="Arial"/>
       <w:b/>
       <w:bCs/>
       <w:smallCaps/>
@@ -2396,6 +2492,7 @@
     <w:qFormat/>
     <w:rsid w:val="00FC693F"/>
     <w:rPr>
+      <w:rFonts w:ascii="Arial" w:hAnsi="Arial"/>
       <w:b/>
       <w:bCs/>
       <w:smallCaps/>
@@ -2414,6 +2511,9 @@
     <w:pPr>
       <w:outlineLvl w:val="9"/>
     </w:pPr>
+    <w:rPr>
+      <w:rFonts w:ascii="Arial" w:hAnsi="Arial"/>
+    </w:rPr>
   </w:style>
   <w:style w:type="table" w:styleId="TableGrid">
     <w:name w:val="Table Grid"/>
@@ -2423,6 +2523,9 @@
     <w:pPr>
       <w:spacing w:after="0" w:line="240" w:lineRule="auto"/>
     </w:pPr>
+    <w:rPr>
+      <w:rFonts w:ascii="Arial" w:hAnsi="Arial"/>
+    </w:rPr>
     <w:tblPr>
       <w:tblInd w:w="0" w:type="dxa"/>
       <w:tblBorders>
@@ -2450,6 +2553,7 @@
       <w:spacing w:after="0" w:line="240" w:lineRule="auto"/>
     </w:pPr>
     <w:rPr>
+      <w:rFonts w:ascii="Arial" w:hAnsi="Arial"/>
       <w:color w:val="000000" w:themeColor="text1" w:themeShade="BF"/>
     </w:rPr>
     <w:tblPr>
@@ -2553,6 +2657,7 @@
       <w:spacing w:after="0" w:line="240" w:lineRule="auto"/>
     </w:pPr>
     <w:rPr>
+      <w:rFonts w:ascii="Arial" w:hAnsi="Arial"/>
       <w:color w:val="365F91" w:themeColor="accent1" w:themeShade="BF"/>
     </w:rPr>
     <w:tblPr>
@@ -2656,6 +2761,7 @@
       <w:spacing w:after="0" w:line="240" w:lineRule="auto"/>
     </w:pPr>
     <w:rPr>
+      <w:rFonts w:ascii="Arial" w:hAnsi="Arial"/>
       <w:color w:val="943634" w:themeColor="accent2" w:themeShade="BF"/>
     </w:rPr>
     <w:tblPr>
@@ -2759,6 +2865,7 @@
       <w:spacing w:after="0" w:line="240" w:lineRule="auto"/>
     </w:pPr>
     <w:rPr>
+      <w:rFonts w:ascii="Arial" w:hAnsi="Arial"/>
       <w:color w:val="76923C" w:themeColor="accent3" w:themeShade="BF"/>
     </w:rPr>
     <w:tblPr>
@@ -2862,6 +2969,7 @@
       <w:spacing w:after="0" w:line="240" w:lineRule="auto"/>
     </w:pPr>
     <w:rPr>
+      <w:rFonts w:ascii="Arial" w:hAnsi="Arial"/>
       <w:color w:val="5F497A" w:themeColor="accent4" w:themeShade="BF"/>
     </w:rPr>
     <w:tblPr>
@@ -2965,6 +3073,7 @@
       <w:spacing w:after="0" w:line="240" w:lineRule="auto"/>
     </w:pPr>
     <w:rPr>
+      <w:rFonts w:ascii="Arial" w:hAnsi="Arial"/>
       <w:color w:val="31849B" w:themeColor="accent5" w:themeShade="BF"/>
     </w:rPr>
     <w:tblPr>
@@ -3068,6 +3177,7 @@
       <w:spacing w:after="0" w:line="240" w:lineRule="auto"/>
     </w:pPr>
     <w:rPr>
+      <w:rFonts w:ascii="Arial" w:hAnsi="Arial"/>
       <w:color w:val="E36C0A" w:themeColor="accent6" w:themeShade="BF"/>
     </w:rPr>
     <w:tblPr>
@@ -3170,6 +3280,9 @@
     <w:pPr>
       <w:spacing w:after="0" w:line="240" w:lineRule="auto"/>
     </w:pPr>
+    <w:rPr>
+      <w:rFonts w:ascii="Arial" w:hAnsi="Arial"/>
+    </w:rPr>
     <w:tblPr>
       <w:tblStyleRowBandSize w:val="1"/>
       <w:tblStyleColBandSize w:val="1"/>
@@ -3262,6 +3375,9 @@
     <w:pPr>
       <w:spacing w:after="0" w:line="240" w:lineRule="auto"/>
     </w:pPr>
+    <w:rPr>
+      <w:rFonts w:ascii="Arial" w:hAnsi="Arial"/>
+    </w:rPr>
     <w:tblPr>
       <w:tblStyleRowBandSize w:val="1"/>
       <w:tblStyleColBandSize w:val="1"/>
@@ -3354,6 +3470,9 @@
     <w:pPr>
       <w:spacing w:after="0" w:line="240" w:lineRule="auto"/>
     </w:pPr>
+    <w:rPr>
+      <w:rFonts w:ascii="Arial" w:hAnsi="Arial"/>
+    </w:rPr>
     <w:tblPr>
       <w:tblStyleRowBandSize w:val="1"/>
       <w:tblStyleColBandSize w:val="1"/>
@@ -3446,6 +3565,9 @@
     <w:pPr>
       <w:spacing w:after="0" w:line="240" w:lineRule="auto"/>
     </w:pPr>
+    <w:rPr>
+      <w:rFonts w:ascii="Arial" w:hAnsi="Arial"/>
+    </w:rPr>
     <w:tblPr>
       <w:tblStyleRowBandSize w:val="1"/>
       <w:tblStyleColBandSize w:val="1"/>
@@ -3538,6 +3660,9 @@
     <w:pPr>
       <w:spacing w:after="0" w:line="240" w:lineRule="auto"/>
     </w:pPr>
+    <w:rPr>
+      <w:rFonts w:ascii="Arial" w:hAnsi="Arial"/>
+    </w:rPr>
     <w:tblPr>
       <w:tblStyleRowBandSize w:val="1"/>
       <w:tblStyleColBandSize w:val="1"/>
@@ -3630,6 +3755,9 @@
     <w:pPr>
       <w:spacing w:after="0" w:line="240" w:lineRule="auto"/>
     </w:pPr>
+    <w:rPr>
+      <w:rFonts w:ascii="Arial" w:hAnsi="Arial"/>
+    </w:rPr>
     <w:tblPr>
       <w:tblStyleRowBandSize w:val="1"/>
       <w:tblStyleColBandSize w:val="1"/>
@@ -3722,6 +3850,9 @@
     <w:pPr>
       <w:spacing w:after="0" w:line="240" w:lineRule="auto"/>
     </w:pPr>
+    <w:rPr>
+      <w:rFonts w:ascii="Arial" w:hAnsi="Arial"/>
+    </w:rPr>
     <w:tblPr>
       <w:tblStyleRowBandSize w:val="1"/>
       <w:tblStyleColBandSize w:val="1"/>
@@ -3814,6 +3945,9 @@
     <w:pPr>
       <w:spacing w:after="0" w:line="240" w:lineRule="auto"/>
     </w:pPr>
+    <w:rPr>
+      <w:rFonts w:ascii="Arial" w:hAnsi="Arial"/>
+    </w:rPr>
     <w:tblPr>
       <w:tblStyleRowBandSize w:val="1"/>
       <w:tblStyleColBandSize w:val="1"/>
@@ -3944,6 +4078,9 @@
     <w:pPr>
       <w:spacing w:after="0" w:line="240" w:lineRule="auto"/>
     </w:pPr>
+    <w:rPr>
+      <w:rFonts w:ascii="Arial" w:hAnsi="Arial"/>
+    </w:rPr>
     <w:tblPr>
       <w:tblStyleRowBandSize w:val="1"/>
       <w:tblStyleColBandSize w:val="1"/>
@@ -4074,6 +4211,9 @@
     <w:pPr>
       <w:spacing w:after="0" w:line="240" w:lineRule="auto"/>
     </w:pPr>
+    <w:rPr>
+      <w:rFonts w:ascii="Arial" w:hAnsi="Arial"/>
+    </w:rPr>
     <w:tblPr>
       <w:tblStyleRowBandSize w:val="1"/>
       <w:tblStyleColBandSize w:val="1"/>
@@ -4204,6 +4344,9 @@
     <w:pPr>
       <w:spacing w:after="0" w:line="240" w:lineRule="auto"/>
     </w:pPr>
+    <w:rPr>
+      <w:rFonts w:ascii="Arial" w:hAnsi="Arial"/>
+    </w:rPr>
     <w:tblPr>
       <w:tblStyleRowBandSize w:val="1"/>
       <w:tblStyleColBandSize w:val="1"/>
@@ -4334,6 +4477,9 @@
     <w:pPr>
       <w:spacing w:after="0" w:line="240" w:lineRule="auto"/>
     </w:pPr>
+    <w:rPr>
+      <w:rFonts w:ascii="Arial" w:hAnsi="Arial"/>
+    </w:rPr>
     <w:tblPr>
       <w:tblStyleRowBandSize w:val="1"/>
       <w:tblStyleColBandSize w:val="1"/>
@@ -4464,6 +4610,9 @@
     <w:pPr>
       <w:spacing w:after="0" w:line="240" w:lineRule="auto"/>
     </w:pPr>
+    <w:rPr>
+      <w:rFonts w:ascii="Arial" w:hAnsi="Arial"/>
+    </w:rPr>
     <w:tblPr>
       <w:tblStyleRowBandSize w:val="1"/>
       <w:tblStyleColBandSize w:val="1"/>
@@ -4594,6 +4743,9 @@
     <w:pPr>
       <w:spacing w:after="0" w:line="240" w:lineRule="auto"/>
     </w:pPr>
+    <w:rPr>
+      <w:rFonts w:ascii="Arial" w:hAnsi="Arial"/>
+    </w:rPr>
     <w:tblPr>
       <w:tblStyleRowBandSize w:val="1"/>
       <w:tblStyleColBandSize w:val="1"/>
@@ -4724,6 +4876,9 @@
     <w:pPr>
       <w:spacing w:after="0" w:line="240" w:lineRule="auto"/>
     </w:pPr>
+    <w:rPr>
+      <w:rFonts w:ascii="Arial" w:hAnsi="Arial"/>
+    </w:rPr>
     <w:tblPr>
       <w:tblStyleRowBandSize w:val="1"/>
       <w:tblStyleColBandSize w:val="1"/>
@@ -4830,6 +4985,9 @@
     <w:pPr>
       <w:spacing w:after="0" w:line="240" w:lineRule="auto"/>
     </w:pPr>
+    <w:rPr>
+      <w:rFonts w:ascii="Arial" w:hAnsi="Arial"/>
+    </w:rPr>
     <w:tblPr>
       <w:tblStyleRowBandSize w:val="1"/>
       <w:tblStyleColBandSize w:val="1"/>
@@ -4936,6 +5094,9 @@
     <w:pPr>
       <w:spacing w:after="0" w:line="240" w:lineRule="auto"/>
     </w:pPr>
+    <w:rPr>
+      <w:rFonts w:ascii="Arial" w:hAnsi="Arial"/>
+    </w:rPr>
     <w:tblPr>
       <w:tblStyleRowBandSize w:val="1"/>
       <w:tblStyleColBandSize w:val="1"/>
@@ -5042,6 +5203,9 @@
     <w:pPr>
       <w:spacing w:after="0" w:line="240" w:lineRule="auto"/>
     </w:pPr>
+    <w:rPr>
+      <w:rFonts w:ascii="Arial" w:hAnsi="Arial"/>
+    </w:rPr>
     <w:tblPr>
       <w:tblStyleRowBandSize w:val="1"/>
       <w:tblStyleColBandSize w:val="1"/>
@@ -5148,6 +5312,9 @@
     <w:pPr>
       <w:spacing w:after="0" w:line="240" w:lineRule="auto"/>
     </w:pPr>
+    <w:rPr>
+      <w:rFonts w:ascii="Arial" w:hAnsi="Arial"/>
+    </w:rPr>
     <w:tblPr>
       <w:tblStyleRowBandSize w:val="1"/>
       <w:tblStyleColBandSize w:val="1"/>
@@ -5254,6 +5421,9 @@
     <w:pPr>
       <w:spacing w:after="0" w:line="240" w:lineRule="auto"/>
     </w:pPr>
+    <w:rPr>
+      <w:rFonts w:ascii="Arial" w:hAnsi="Arial"/>
+    </w:rPr>
     <w:tblPr>
       <w:tblStyleRowBandSize w:val="1"/>
       <w:tblStyleColBandSize w:val="1"/>
@@ -5360,6 +5530,9 @@
     <w:pPr>
       <w:spacing w:after="0" w:line="240" w:lineRule="auto"/>
     </w:pPr>
+    <w:rPr>
+      <w:rFonts w:ascii="Arial" w:hAnsi="Arial"/>
+    </w:rPr>
     <w:tblPr>
       <w:tblStyleRowBandSize w:val="1"/>
       <w:tblStyleColBandSize w:val="1"/>
@@ -5466,6 +5639,9 @@
     <w:pPr>
       <w:spacing w:after="0" w:line="240" w:lineRule="auto"/>
     </w:pPr>
+    <w:rPr>
+      <w:rFonts w:ascii="Arial" w:hAnsi="Arial"/>
+    </w:rPr>
     <w:tblPr>
       <w:tblStyleRowBandSize w:val="1"/>
       <w:tblStyleColBandSize w:val="1"/>
@@ -5615,6 +5791,9 @@
     <w:pPr>
       <w:spacing w:after="0" w:line="240" w:lineRule="auto"/>
     </w:pPr>
+    <w:rPr>
+      <w:rFonts w:ascii="Arial" w:hAnsi="Arial"/>
+    </w:rPr>
     <w:tblPr>
       <w:tblStyleRowBandSize w:val="1"/>
       <w:tblStyleColBandSize w:val="1"/>
@@ -5764,6 +5943,9 @@
     <w:pPr>
       <w:spacing w:after="0" w:line="240" w:lineRule="auto"/>
     </w:pPr>
+    <w:rPr>
+      <w:rFonts w:ascii="Arial" w:hAnsi="Arial"/>
+    </w:rPr>
     <w:tblPr>
       <w:tblStyleRowBandSize w:val="1"/>
       <w:tblStyleColBandSize w:val="1"/>
@@ -5913,6 +6095,9 @@
     <w:pPr>
       <w:spacing w:after="0" w:line="240" w:lineRule="auto"/>
     </w:pPr>
+    <w:rPr>
+      <w:rFonts w:ascii="Arial" w:hAnsi="Arial"/>
+    </w:rPr>
     <w:tblPr>
       <w:tblStyleRowBandSize w:val="1"/>
       <w:tblStyleColBandSize w:val="1"/>
@@ -6062,6 +6247,9 @@
     <w:pPr>
       <w:spacing w:after="0" w:line="240" w:lineRule="auto"/>
     </w:pPr>
+    <w:rPr>
+      <w:rFonts w:ascii="Arial" w:hAnsi="Arial"/>
+    </w:rPr>
     <w:tblPr>
       <w:tblStyleRowBandSize w:val="1"/>
       <w:tblStyleColBandSize w:val="1"/>
@@ -6211,6 +6399,9 @@
     <w:pPr>
       <w:spacing w:after="0" w:line="240" w:lineRule="auto"/>
     </w:pPr>
+    <w:rPr>
+      <w:rFonts w:ascii="Arial" w:hAnsi="Arial"/>
+    </w:rPr>
     <w:tblPr>
       <w:tblStyleRowBandSize w:val="1"/>
       <w:tblStyleColBandSize w:val="1"/>
@@ -6360,6 +6551,9 @@
     <w:pPr>
       <w:spacing w:after="0" w:line="240" w:lineRule="auto"/>
     </w:pPr>
+    <w:rPr>
+      <w:rFonts w:ascii="Arial" w:hAnsi="Arial"/>
+    </w:rPr>
     <w:tblPr>
       <w:tblStyleRowBandSize w:val="1"/>
       <w:tblStyleColBandSize w:val="1"/>
@@ -6510,6 +6704,7 @@
       <w:spacing w:after="0" w:line="240" w:lineRule="auto"/>
     </w:pPr>
     <w:rPr>
+      <w:rFonts w:ascii="Arial" w:hAnsi="Arial"/>
       <w:color w:val="000000" w:themeColor="text1"/>
     </w:rPr>
     <w:tblPr>
@@ -6594,6 +6789,7 @@
       <w:spacing w:after="0" w:line="240" w:lineRule="auto"/>
     </w:pPr>
     <w:rPr>
+      <w:rFonts w:ascii="Arial" w:hAnsi="Arial"/>
       <w:color w:val="000000" w:themeColor="text1"/>
     </w:rPr>
     <w:tblPr>
@@ -6678,6 +6874,7 @@
       <w:spacing w:after="0" w:line="240" w:lineRule="auto"/>
     </w:pPr>
     <w:rPr>
+      <w:rFonts w:ascii="Arial" w:hAnsi="Arial"/>
       <w:color w:val="000000" w:themeColor="text1"/>
     </w:rPr>
     <w:tblPr>
@@ -6762,6 +6959,7 @@
       <w:spacing w:after="0" w:line="240" w:lineRule="auto"/>
     </w:pPr>
     <w:rPr>
+      <w:rFonts w:ascii="Arial" w:hAnsi="Arial"/>
       <w:color w:val="000000" w:themeColor="text1"/>
     </w:rPr>
     <w:tblPr>
@@ -6846,6 +7044,7 @@
       <w:spacing w:after="0" w:line="240" w:lineRule="auto"/>
     </w:pPr>
     <w:rPr>
+      <w:rFonts w:ascii="Arial" w:hAnsi="Arial"/>
       <w:color w:val="000000" w:themeColor="text1"/>
     </w:rPr>
     <w:tblPr>
@@ -6930,6 +7129,7 @@
       <w:spacing w:after="0" w:line="240" w:lineRule="auto"/>
     </w:pPr>
     <w:rPr>
+      <w:rFonts w:ascii="Arial" w:hAnsi="Arial"/>
       <w:color w:val="000000" w:themeColor="text1"/>
     </w:rPr>
     <w:tblPr>
@@ -7014,6 +7214,7 @@
       <w:spacing w:after="0" w:line="240" w:lineRule="auto"/>
     </w:pPr>
     <w:rPr>
+      <w:rFonts w:ascii="Arial" w:hAnsi="Arial"/>
       <w:color w:val="000000" w:themeColor="text1"/>
     </w:rPr>
     <w:tblPr>
@@ -7098,7 +7299,7 @@
       <w:spacing w:after="0" w:line="240" w:lineRule="auto"/>
     </w:pPr>
     <w:rPr>
-      <w:rFonts w:asciiTheme="majorHAnsi" w:eastAsiaTheme="majorEastAsia" w:hAnsiTheme="majorHAnsi" w:cstheme="majorBidi"/>
+      <w:rFonts w:asciiTheme="majorHAnsi" w:eastAsiaTheme="majorEastAsia" w:hAnsiTheme="majorHAnsi" w:cstheme="majorBidi" w:ascii="Arial" w:hAnsi="Arial"/>
       <w:color w:val="000000" w:themeColor="text1"/>
     </w:rPr>
     <w:tblPr>
@@ -7226,7 +7427,7 @@
       <w:spacing w:after="0" w:line="240" w:lineRule="auto"/>
     </w:pPr>
     <w:rPr>
-      <w:rFonts w:asciiTheme="majorHAnsi" w:eastAsiaTheme="majorEastAsia" w:hAnsiTheme="majorHAnsi" w:cstheme="majorBidi"/>
+      <w:rFonts w:asciiTheme="majorHAnsi" w:eastAsiaTheme="majorEastAsia" w:hAnsiTheme="majorHAnsi" w:cstheme="majorBidi" w:ascii="Arial" w:hAnsi="Arial"/>
       <w:color w:val="000000" w:themeColor="text1"/>
     </w:rPr>
     <w:tblPr>
@@ -7354,7 +7555,7 @@
       <w:spacing w:after="0" w:line="240" w:lineRule="auto"/>
     </w:pPr>
     <w:rPr>
-      <w:rFonts w:asciiTheme="majorHAnsi" w:eastAsiaTheme="majorEastAsia" w:hAnsiTheme="majorHAnsi" w:cstheme="majorBidi"/>
+      <w:rFonts w:asciiTheme="majorHAnsi" w:eastAsiaTheme="majorEastAsia" w:hAnsiTheme="majorHAnsi" w:cstheme="majorBidi" w:ascii="Arial" w:hAnsi="Arial"/>
       <w:color w:val="000000" w:themeColor="text1"/>
     </w:rPr>
     <w:tblPr>
@@ -7482,7 +7683,7 @@
       <w:spacing w:after="0" w:line="240" w:lineRule="auto"/>
     </w:pPr>
     <w:rPr>
-      <w:rFonts w:asciiTheme="majorHAnsi" w:eastAsiaTheme="majorEastAsia" w:hAnsiTheme="majorHAnsi" w:cstheme="majorBidi"/>
+      <w:rFonts w:asciiTheme="majorHAnsi" w:eastAsiaTheme="majorEastAsia" w:hAnsiTheme="majorHAnsi" w:cstheme="majorBidi" w:ascii="Arial" w:hAnsi="Arial"/>
       <w:color w:val="000000" w:themeColor="text1"/>
     </w:rPr>
     <w:tblPr>
@@ -7610,7 +7811,7 @@
       <w:spacing w:after="0" w:line="240" w:lineRule="auto"/>
     </w:pPr>
     <w:rPr>
-      <w:rFonts w:asciiTheme="majorHAnsi" w:eastAsiaTheme="majorEastAsia" w:hAnsiTheme="majorHAnsi" w:cstheme="majorBidi"/>
+      <w:rFonts w:asciiTheme="majorHAnsi" w:eastAsiaTheme="majorEastAsia" w:hAnsiTheme="majorHAnsi" w:cstheme="majorBidi" w:ascii="Arial" w:hAnsi="Arial"/>
       <w:color w:val="000000" w:themeColor="text1"/>
     </w:rPr>
     <w:tblPr>
@@ -7738,7 +7939,7 @@
       <w:spacing w:after="0" w:line="240" w:lineRule="auto"/>
     </w:pPr>
     <w:rPr>
-      <w:rFonts w:asciiTheme="majorHAnsi" w:eastAsiaTheme="majorEastAsia" w:hAnsiTheme="majorHAnsi" w:cstheme="majorBidi"/>
+      <w:rFonts w:asciiTheme="majorHAnsi" w:eastAsiaTheme="majorEastAsia" w:hAnsiTheme="majorHAnsi" w:cstheme="majorBidi" w:ascii="Arial" w:hAnsi="Arial"/>
       <w:color w:val="000000" w:themeColor="text1"/>
     </w:rPr>
     <w:tblPr>
@@ -7866,7 +8067,7 @@
       <w:spacing w:after="0" w:line="240" w:lineRule="auto"/>
     </w:pPr>
     <w:rPr>
-      <w:rFonts w:asciiTheme="majorHAnsi" w:eastAsiaTheme="majorEastAsia" w:hAnsiTheme="majorHAnsi" w:cstheme="majorBidi"/>
+      <w:rFonts w:asciiTheme="majorHAnsi" w:eastAsiaTheme="majorEastAsia" w:hAnsiTheme="majorHAnsi" w:cstheme="majorBidi" w:ascii="Arial" w:hAnsi="Arial"/>
       <w:color w:val="000000" w:themeColor="text1"/>
     </w:rPr>
     <w:tblPr>
@@ -7993,6 +8194,9 @@
     <w:pPr>
       <w:spacing w:after="0" w:line="240" w:lineRule="auto"/>
     </w:pPr>
+    <w:rPr>
+      <w:rFonts w:ascii="Arial" w:hAnsi="Arial"/>
+    </w:rPr>
     <w:tblPr>
       <w:tblStyleRowBandSize w:val="1"/>
       <w:tblStyleColBandSize w:val="1"/>
@@ -8066,6 +8270,9 @@
     <w:pPr>
       <w:spacing w:after="0" w:line="240" w:lineRule="auto"/>
     </w:pPr>
+    <w:rPr>
+      <w:rFonts w:ascii="Arial" w:hAnsi="Arial"/>
+    </w:rPr>
     <w:tblPr>
       <w:tblStyleRowBandSize w:val="1"/>
       <w:tblStyleColBandSize w:val="1"/>
@@ -8139,6 +8346,9 @@
     <w:pPr>
       <w:spacing w:after="0" w:line="240" w:lineRule="auto"/>
     </w:pPr>
+    <w:rPr>
+      <w:rFonts w:ascii="Arial" w:hAnsi="Arial"/>
+    </w:rPr>
     <w:tblPr>
       <w:tblStyleRowBandSize w:val="1"/>
       <w:tblStyleColBandSize w:val="1"/>
@@ -8212,6 +8422,9 @@
     <w:pPr>
       <w:spacing w:after="0" w:line="240" w:lineRule="auto"/>
     </w:pPr>
+    <w:rPr>
+      <w:rFonts w:ascii="Arial" w:hAnsi="Arial"/>
+    </w:rPr>
     <w:tblPr>
       <w:tblStyleRowBandSize w:val="1"/>
       <w:tblStyleColBandSize w:val="1"/>
@@ -8285,6 +8498,9 @@
     <w:pPr>
       <w:spacing w:after="0" w:line="240" w:lineRule="auto"/>
     </w:pPr>
+    <w:rPr>
+      <w:rFonts w:ascii="Arial" w:hAnsi="Arial"/>
+    </w:rPr>
     <w:tblPr>
       <w:tblStyleRowBandSize w:val="1"/>
       <w:tblStyleColBandSize w:val="1"/>
@@ -8358,6 +8574,9 @@
     <w:pPr>
       <w:spacing w:after="0" w:line="240" w:lineRule="auto"/>
     </w:pPr>
+    <w:rPr>
+      <w:rFonts w:ascii="Arial" w:hAnsi="Arial"/>
+    </w:rPr>
     <w:tblPr>
       <w:tblStyleRowBandSize w:val="1"/>
       <w:tblStyleColBandSize w:val="1"/>
@@ -8431,6 +8650,9 @@
     <w:pPr>
       <w:spacing w:after="0" w:line="240" w:lineRule="auto"/>
     </w:pPr>
+    <w:rPr>
+      <w:rFonts w:ascii="Arial" w:hAnsi="Arial"/>
+    </w:rPr>
     <w:tblPr>
       <w:tblStyleRowBandSize w:val="1"/>
       <w:tblStyleColBandSize w:val="1"/>
@@ -8505,7 +8727,7 @@
       <w:spacing w:after="0" w:line="240" w:lineRule="auto"/>
     </w:pPr>
     <w:rPr>
-      <w:rFonts w:asciiTheme="majorHAnsi" w:eastAsiaTheme="majorEastAsia" w:hAnsiTheme="majorHAnsi" w:cstheme="majorBidi"/>
+      <w:rFonts w:asciiTheme="majorHAnsi" w:eastAsiaTheme="majorEastAsia" w:hAnsiTheme="majorHAnsi" w:cstheme="majorBidi" w:ascii="Arial" w:hAnsi="Arial"/>
       <w:color w:val="000000" w:themeColor="text1"/>
     </w:rPr>
     <w:tblPr>
@@ -8630,7 +8852,7 @@
       <w:spacing w:after="0" w:line="240" w:lineRule="auto"/>
     </w:pPr>
     <w:rPr>
-      <w:rFonts w:asciiTheme="majorHAnsi" w:eastAsiaTheme="majorEastAsia" w:hAnsiTheme="majorHAnsi" w:cstheme="majorBidi"/>
+      <w:rFonts w:asciiTheme="majorHAnsi" w:eastAsiaTheme="majorEastAsia" w:hAnsiTheme="majorHAnsi" w:cstheme="majorBidi" w:ascii="Arial" w:hAnsi="Arial"/>
       <w:color w:val="000000" w:themeColor="text1"/>
     </w:rPr>
     <w:tblPr>
@@ -8755,7 +8977,7 @@
       <w:spacing w:after="0" w:line="240" w:lineRule="auto"/>
     </w:pPr>
     <w:rPr>
-      <w:rFonts w:asciiTheme="majorHAnsi" w:eastAsiaTheme="majorEastAsia" w:hAnsiTheme="majorHAnsi" w:cstheme="majorBidi"/>
+      <w:rFonts w:asciiTheme="majorHAnsi" w:eastAsiaTheme="majorEastAsia" w:hAnsiTheme="majorHAnsi" w:cstheme="majorBidi" w:ascii="Arial" w:hAnsi="Arial"/>
       <w:color w:val="000000" w:themeColor="text1"/>
     </w:rPr>
     <w:tblPr>
@@ -8880,7 +9102,7 @@
       <w:spacing w:after="0" w:line="240" w:lineRule="auto"/>
     </w:pPr>
     <w:rPr>
-      <w:rFonts w:asciiTheme="majorHAnsi" w:eastAsiaTheme="majorEastAsia" w:hAnsiTheme="majorHAnsi" w:cstheme="majorBidi"/>
+      <w:rFonts w:asciiTheme="majorHAnsi" w:eastAsiaTheme="majorEastAsia" w:hAnsiTheme="majorHAnsi" w:cstheme="majorBidi" w:ascii="Arial" w:hAnsi="Arial"/>
       <w:color w:val="000000" w:themeColor="text1"/>
     </w:rPr>
     <w:tblPr>
@@ -9005,7 +9227,7 @@
       <w:spacing w:after="0" w:line="240" w:lineRule="auto"/>
     </w:pPr>
     <w:rPr>
-      <w:rFonts w:asciiTheme="majorHAnsi" w:eastAsiaTheme="majorEastAsia" w:hAnsiTheme="majorHAnsi" w:cstheme="majorBidi"/>
+      <w:rFonts w:asciiTheme="majorHAnsi" w:eastAsiaTheme="majorEastAsia" w:hAnsiTheme="majorHAnsi" w:cstheme="majorBidi" w:ascii="Arial" w:hAnsi="Arial"/>
       <w:color w:val="000000" w:themeColor="text1"/>
     </w:rPr>
     <w:tblPr>
@@ -9130,7 +9352,7 @@
       <w:spacing w:after="0" w:line="240" w:lineRule="auto"/>
     </w:pPr>
     <w:rPr>
-      <w:rFonts w:asciiTheme="majorHAnsi" w:eastAsiaTheme="majorEastAsia" w:hAnsiTheme="majorHAnsi" w:cstheme="majorBidi"/>
+      <w:rFonts w:asciiTheme="majorHAnsi" w:eastAsiaTheme="majorEastAsia" w:hAnsiTheme="majorHAnsi" w:cstheme="majorBidi" w:ascii="Arial" w:hAnsi="Arial"/>
       <w:color w:val="000000" w:themeColor="text1"/>
     </w:rPr>
     <w:tblPr>
@@ -9255,7 +9477,7 @@
       <w:spacing w:after="0" w:line="240" w:lineRule="auto"/>
     </w:pPr>
     <w:rPr>
-      <w:rFonts w:asciiTheme="majorHAnsi" w:eastAsiaTheme="majorEastAsia" w:hAnsiTheme="majorHAnsi" w:cstheme="majorBidi"/>
+      <w:rFonts w:asciiTheme="majorHAnsi" w:eastAsiaTheme="majorEastAsia" w:hAnsiTheme="majorHAnsi" w:cstheme="majorBidi" w:ascii="Arial" w:hAnsi="Arial"/>
       <w:color w:val="000000" w:themeColor="text1"/>
     </w:rPr>
     <w:tblPr>
@@ -9379,6 +9601,9 @@
     <w:pPr>
       <w:spacing w:after="0" w:line="240" w:lineRule="auto"/>
     </w:pPr>
+    <w:rPr>
+      <w:rFonts w:ascii="Arial" w:hAnsi="Arial"/>
+    </w:rPr>
     <w:tblPr>
       <w:tblStyleRowBandSize w:val="1"/>
       <w:tblStyleColBandSize w:val="1"/>
@@ -9520,6 +9745,9 @@
     <w:pPr>
       <w:spacing w:after="0" w:line="240" w:lineRule="auto"/>
     </w:pPr>
+    <w:rPr>
+      <w:rFonts w:ascii="Arial" w:hAnsi="Arial"/>
+    </w:rPr>
     <w:tblPr>
       <w:tblStyleRowBandSize w:val="1"/>
       <w:tblStyleColBandSize w:val="1"/>
@@ -9661,6 +9889,9 @@
     <w:pPr>
       <w:spacing w:after="0" w:line="240" w:lineRule="auto"/>
     </w:pPr>
+    <w:rPr>
+      <w:rFonts w:ascii="Arial" w:hAnsi="Arial"/>
+    </w:rPr>
     <w:tblPr>
       <w:tblStyleRowBandSize w:val="1"/>
       <w:tblStyleColBandSize w:val="1"/>
@@ -9802,6 +10033,9 @@
     <w:pPr>
       <w:spacing w:after="0" w:line="240" w:lineRule="auto"/>
     </w:pPr>
+    <w:rPr>
+      <w:rFonts w:ascii="Arial" w:hAnsi="Arial"/>
+    </w:rPr>
     <w:tblPr>
       <w:tblStyleRowBandSize w:val="1"/>
       <w:tblStyleColBandSize w:val="1"/>
@@ -9943,6 +10177,9 @@
     <w:pPr>
       <w:spacing w:after="0" w:line="240" w:lineRule="auto"/>
     </w:pPr>
+    <w:rPr>
+      <w:rFonts w:ascii="Arial" w:hAnsi="Arial"/>
+    </w:rPr>
     <w:tblPr>
       <w:tblStyleRowBandSize w:val="1"/>
       <w:tblStyleColBandSize w:val="1"/>
@@ -10084,6 +10321,9 @@
     <w:pPr>
       <w:spacing w:after="0" w:line="240" w:lineRule="auto"/>
     </w:pPr>
+    <w:rPr>
+      <w:rFonts w:ascii="Arial" w:hAnsi="Arial"/>
+    </w:rPr>
     <w:tblPr>
       <w:tblStyleRowBandSize w:val="1"/>
       <w:tblStyleColBandSize w:val="1"/>
@@ -10225,6 +10465,9 @@
     <w:pPr>
       <w:spacing w:after="0" w:line="240" w:lineRule="auto"/>
     </w:pPr>
+    <w:rPr>
+      <w:rFonts w:ascii="Arial" w:hAnsi="Arial"/>
+    </w:rPr>
     <w:tblPr>
       <w:tblStyleRowBandSize w:val="1"/>
       <w:tblStyleColBandSize w:val="1"/>
@@ -10367,6 +10610,7 @@
       <w:spacing w:after="0" w:line="240" w:lineRule="auto"/>
     </w:pPr>
     <w:rPr>
+      <w:rFonts w:ascii="Arial" w:hAnsi="Arial"/>
       <w:color w:val="FFFFFF" w:themeColor="background1"/>
     </w:rPr>
     <w:tblPr>
@@ -10481,6 +10725,7 @@
       <w:spacing w:after="0" w:line="240" w:lineRule="auto"/>
     </w:pPr>
     <w:rPr>
+      <w:rFonts w:ascii="Arial" w:hAnsi="Arial"/>
       <w:color w:val="FFFFFF" w:themeColor="background1"/>
     </w:rPr>
     <w:tblPr>
@@ -10595,6 +10840,7 @@
       <w:spacing w:after="0" w:line="240" w:lineRule="auto"/>
     </w:pPr>
     <w:rPr>
+      <w:rFonts w:ascii="Arial" w:hAnsi="Arial"/>
       <w:color w:val="FFFFFF" w:themeColor="background1"/>
     </w:rPr>
     <w:tblPr>
@@ -10709,6 +10955,7 @@
       <w:spacing w:after="0" w:line="240" w:lineRule="auto"/>
     </w:pPr>
     <w:rPr>
+      <w:rFonts w:ascii="Arial" w:hAnsi="Arial"/>
       <w:color w:val="FFFFFF" w:themeColor="background1"/>
     </w:rPr>
     <w:tblPr>
@@ -10823,6 +11070,7 @@
       <w:spacing w:after="0" w:line="240" w:lineRule="auto"/>
     </w:pPr>
     <w:rPr>
+      <w:rFonts w:ascii="Arial" w:hAnsi="Arial"/>
       <w:color w:val="FFFFFF" w:themeColor="background1"/>
     </w:rPr>
     <w:tblPr>
@@ -10937,6 +11185,7 @@
       <w:spacing w:after="0" w:line="240" w:lineRule="auto"/>
     </w:pPr>
     <w:rPr>
+      <w:rFonts w:ascii="Arial" w:hAnsi="Arial"/>
       <w:color w:val="FFFFFF" w:themeColor="background1"/>
     </w:rPr>
     <w:tblPr>
@@ -11051,6 +11300,7 @@
       <w:spacing w:after="0" w:line="240" w:lineRule="auto"/>
     </w:pPr>
     <w:rPr>
+      <w:rFonts w:ascii="Arial" w:hAnsi="Arial"/>
       <w:color w:val="FFFFFF" w:themeColor="background1"/>
     </w:rPr>
     <w:tblPr>
@@ -11165,6 +11415,7 @@
       <w:spacing w:after="0" w:line="240" w:lineRule="auto"/>
     </w:pPr>
     <w:rPr>
+      <w:rFonts w:ascii="Arial" w:hAnsi="Arial"/>
       <w:color w:val="000000" w:themeColor="text1"/>
     </w:rPr>
     <w:tblPr>
@@ -11287,6 +11538,7 @@
       <w:spacing w:after="0" w:line="240" w:lineRule="auto"/>
     </w:pPr>
     <w:rPr>
+      <w:rFonts w:ascii="Arial" w:hAnsi="Arial"/>
       <w:color w:val="000000" w:themeColor="text1"/>
     </w:rPr>
     <w:tblPr>
@@ -11409,6 +11661,7 @@
       <w:spacing w:after="0" w:line="240" w:lineRule="auto"/>
     </w:pPr>
     <w:rPr>
+      <w:rFonts w:ascii="Arial" w:hAnsi="Arial"/>
       <w:color w:val="000000" w:themeColor="text1"/>
     </w:rPr>
     <w:tblPr>
@@ -11531,6 +11784,7 @@
       <w:spacing w:after="0" w:line="240" w:lineRule="auto"/>
     </w:pPr>
     <w:rPr>
+      <w:rFonts w:ascii="Arial" w:hAnsi="Arial"/>
       <w:color w:val="000000" w:themeColor="text1"/>
     </w:rPr>
     <w:tblPr>
@@ -11643,6 +11897,7 @@
       <w:spacing w:after="0" w:line="240" w:lineRule="auto"/>
     </w:pPr>
     <w:rPr>
+      <w:rFonts w:ascii="Arial" w:hAnsi="Arial"/>
       <w:color w:val="000000" w:themeColor="text1"/>
     </w:rPr>
     <w:tblPr>
@@ -11765,6 +12020,7 @@
       <w:spacing w:after="0" w:line="240" w:lineRule="auto"/>
     </w:pPr>
     <w:rPr>
+      <w:rFonts w:ascii="Arial" w:hAnsi="Arial"/>
       <w:color w:val="000000" w:themeColor="text1"/>
     </w:rPr>
     <w:tblPr>
@@ -11887,6 +12143,7 @@
       <w:spacing w:after="0" w:line="240" w:lineRule="auto"/>
     </w:pPr>
     <w:rPr>
+      <w:rFonts w:ascii="Arial" w:hAnsi="Arial"/>
       <w:color w:val="000000" w:themeColor="text1"/>
     </w:rPr>
     <w:tblPr>
@@ -12009,6 +12266,7 @@
       <w:spacing w:after="0" w:line="240" w:lineRule="auto"/>
     </w:pPr>
     <w:rPr>
+      <w:rFonts w:ascii="Arial" w:hAnsi="Arial"/>
       <w:color w:val="000000" w:themeColor="text1"/>
     </w:rPr>
     <w:tblPr>
@@ -12095,6 +12353,7 @@
       <w:spacing w:after="0" w:line="240" w:lineRule="auto"/>
     </w:pPr>
     <w:rPr>
+      <w:rFonts w:ascii="Arial" w:hAnsi="Arial"/>
       <w:color w:val="000000" w:themeColor="text1"/>
     </w:rPr>
     <w:tblPr>
@@ -12181,6 +12440,7 @@
       <w:spacing w:after="0" w:line="240" w:lineRule="auto"/>
     </w:pPr>
     <w:rPr>
+      <w:rFonts w:ascii="Arial" w:hAnsi="Arial"/>
       <w:color w:val="000000" w:themeColor="text1"/>
     </w:rPr>
     <w:tblPr>
@@ -12267,6 +12527,7 @@
       <w:spacing w:after="0" w:line="240" w:lineRule="auto"/>
     </w:pPr>
     <w:rPr>
+      <w:rFonts w:ascii="Arial" w:hAnsi="Arial"/>
       <w:color w:val="000000" w:themeColor="text1"/>
     </w:rPr>
     <w:tblPr>
@@ -12353,6 +12614,7 @@
       <w:spacing w:after="0" w:line="240" w:lineRule="auto"/>
     </w:pPr>
     <w:rPr>
+      <w:rFonts w:ascii="Arial" w:hAnsi="Arial"/>
       <w:color w:val="000000" w:themeColor="text1"/>
     </w:rPr>
     <w:tblPr>
@@ -12439,6 +12701,7 @@
       <w:spacing w:after="0" w:line="240" w:lineRule="auto"/>
     </w:pPr>
     <w:rPr>
+      <w:rFonts w:ascii="Arial" w:hAnsi="Arial"/>
       <w:color w:val="000000" w:themeColor="text1"/>
     </w:rPr>
     <w:tblPr>
@@ -12525,6 +12788,7 @@
       <w:spacing w:after="0" w:line="240" w:lineRule="auto"/>
     </w:pPr>
     <w:rPr>
+      <w:rFonts w:ascii="Arial" w:hAnsi="Arial"/>
       <w:color w:val="000000" w:themeColor="text1"/>
     </w:rPr>
     <w:tblPr>
@@ -12611,6 +12875,7 @@
       <w:spacing w:after="0" w:line="240" w:lineRule="auto"/>
     </w:pPr>
     <w:rPr>
+      <w:rFonts w:ascii="Arial" w:hAnsi="Arial"/>
       <w:color w:val="000000" w:themeColor="text1"/>
     </w:rPr>
     <w:tblPr>
@@ -12691,6 +12956,7 @@
       <w:spacing w:after="0" w:line="240" w:lineRule="auto"/>
     </w:pPr>
     <w:rPr>
+      <w:rFonts w:ascii="Arial" w:hAnsi="Arial"/>
       <w:color w:val="000000" w:themeColor="text1"/>
     </w:rPr>
     <w:tblPr>
@@ -12771,6 +13037,7 @@
       <w:spacing w:after="0" w:line="240" w:lineRule="auto"/>
     </w:pPr>
     <w:rPr>
+      <w:rFonts w:ascii="Arial" w:hAnsi="Arial"/>
       <w:color w:val="000000" w:themeColor="text1"/>
     </w:rPr>
     <w:tblPr>
@@ -12851,6 +13118,7 @@
       <w:spacing w:after="0" w:line="240" w:lineRule="auto"/>
     </w:pPr>
     <w:rPr>
+      <w:rFonts w:ascii="Arial" w:hAnsi="Arial"/>
       <w:color w:val="000000" w:themeColor="text1"/>
     </w:rPr>
     <w:tblPr>
@@ -12931,6 +13199,7 @@
       <w:spacing w:after="0" w:line="240" w:lineRule="auto"/>
     </w:pPr>
     <w:rPr>
+      <w:rFonts w:ascii="Arial" w:hAnsi="Arial"/>
       <w:color w:val="000000" w:themeColor="text1"/>
     </w:rPr>
     <w:tblPr>
@@ -13011,6 +13280,7 @@
       <w:spacing w:after="0" w:line="240" w:lineRule="auto"/>
     </w:pPr>
     <w:rPr>
+      <w:rFonts w:ascii="Arial" w:hAnsi="Arial"/>
       <w:color w:val="000000" w:themeColor="text1"/>
     </w:rPr>
     <w:tblPr>
@@ -13091,6 +13361,7 @@
       <w:spacing w:after="0" w:line="240" w:lineRule="auto"/>
     </w:pPr>
     <w:rPr>
+      <w:rFonts w:ascii="Arial" w:hAnsi="Arial"/>
       <w:color w:val="000000" w:themeColor="text1"/>
     </w:rPr>
     <w:tblPr>

</xml_diff>